<commit_message>
tabela cadastro cliente,calculo de frete
</commit_message>
<xml_diff>
--- a/projeto_analise_vest-shop.docx
+++ b/projeto_analise_vest-shop.docx
@@ -649,527 +649,6 @@
           <w:rtl w:val="0"/>
         </w:rPr>
         <w:t xml:space="preserve">O que o sistema FAZ (Escopo Incluído):</w:t>
-      </w:r>
-    </w:p>
-    <w:p>
-      <w:pPr>
-        <w:numPr>
-          <w:ilvl w:val="0"/>
-          <w:numId w:val="3"/>
-        </w:numPr>
-        <w:spacing w:after="0" w:afterAutospacing="0" w:before="240" w:lineRule="auto"/>
-        <w:ind w:left="720" w:hanging="360"/>
-        <w:jc w:val="both"/>
-        <w:rPr>
-          <w:sz w:val="24"/>
-          <w:szCs w:val="24"/>
-          <w:u w:val="none"/>
-        </w:rPr>
-      </w:pPr>
-      <w:r>
-        <w:rPr>
-          <w:sz w:val="24"/>
-          <w:szCs w:val="24"/>
-          <w:rtl w:val="0"/>
-        </w:rPr>
-        <w:t xml:space="preserve">Cadastro de clientes com Onboarding interativo e perfil de preferências (estilo, tamanho, gênero).</w:t>
-      </w:r>
-    </w:p>
-    <w:p>
-      <w:pPr>
-        <w:numPr>
-          <w:ilvl w:val="0"/>
-          <w:numId w:val="3"/>
-        </w:numPr>
-        <w:spacing w:after="0" w:afterAutospacing="0" w:before="0" w:beforeAutospacing="0" w:lineRule="auto"/>
-        <w:ind w:left="720" w:hanging="360"/>
-        <w:jc w:val="both"/>
-        <w:rPr>
-          <w:sz w:val="24"/>
-          <w:szCs w:val="24"/>
-        </w:rPr>
-      </w:pPr>
-      <w:r>
-        <w:rPr>
-          <w:sz w:val="24"/>
-          <w:szCs w:val="24"/>
-          <w:rtl w:val="0"/>
-        </w:rPr>
-        <w:t xml:space="preserve">Cálculo automatizado de frete regional e conversão de frete internacional com moedas estrangeiras.</w:t>
-      </w:r>
-    </w:p>
-    <w:p>
-      <w:pPr>
-        <w:numPr>
-          <w:ilvl w:val="0"/>
-          <w:numId w:val="3"/>
-        </w:numPr>
-        <w:spacing w:after="240" w:before="0" w:beforeAutospacing="0" w:lineRule="auto"/>
-        <w:ind w:left="720" w:hanging="360"/>
-        <w:jc w:val="both"/>
-        <w:rPr>
-          <w:sz w:val="24"/>
-          <w:szCs w:val="24"/>
-          <w:u w:val="none"/>
-        </w:rPr>
-      </w:pPr>
-      <w:r>
-        <w:rPr>
-          <w:sz w:val="24"/>
-          <w:szCs w:val="24"/>
-          <w:rtl w:val="0"/>
-        </w:rPr>
-        <w:t xml:space="preserve">também ajudará o cliente com o suporte </w:t>
-      </w:r>
-    </w:p>
-    <w:p>
-      <w:pPr>
-        <w:spacing w:after="240" w:before="240" w:lineRule="auto"/>
-        <w:ind w:left="720" w:firstLine="0"/>
-        <w:jc w:val="both"/>
-        <w:rPr>
-          <w:b w:val="1"/>
-          <w:bCs w:val="1"/>
-          <w:sz w:val="24"/>
-          <w:szCs w:val="24"/>
-        </w:rPr>
-      </w:pPr>
-      <w:r>
-        <w:rPr>
-          <w:b w:val="1"/>
-          <w:bCs w:val="1"/>
-          <w:sz w:val="24"/>
-          <w:szCs w:val="24"/>
-          <w:rtl w:val="0"/>
-        </w:rPr>
-        <w:t xml:space="preserve">oderação e Banimento de Produtos Falsificados: </w:t>
-      </w:r>
-      <w:r>
-        <w:rPr>
-          <w:sz w:val="24"/>
-          <w:szCs w:val="24"/>
-          <w:rtl w:val="0"/>
-        </w:rPr>
-        <w:t xml:space="preserve">Permitir a análise de denúncias, suspensão preventiva e banimento definitivo de anunciantes que comercializarem réplicas ou produtos não originais.</w:t>
-      </w:r>
-      <w:r>
-        <w:rPr>
-          <w:rtl w:val="0"/>
-        </w:rPr>
-      </w:r>
-    </w:p>
-    <w:p>
-      <w:pPr>
-        <w:spacing w:after="240" w:before="240" w:lineRule="auto"/>
-        <w:ind w:left="720" w:firstLine="0"/>
-        <w:jc w:val="both"/>
-        <w:rPr>
-          <w:b w:val="1"/>
-          <w:bCs w:val="1"/>
-          <w:sz w:val="24"/>
-          <w:szCs w:val="24"/>
-        </w:rPr>
-      </w:pPr>
-      <w:r>
-        <w:rPr>
-          <w:b w:val="1"/>
-          <w:bCs w:val="1"/>
-          <w:sz w:val="24"/>
-          <w:szCs w:val="24"/>
-          <w:rtl w:val="0"/>
-        </w:rPr>
-        <w:t xml:space="preserve">RF04 - Geração de Relatórios Analíticos de Tendências: </w:t>
-      </w:r>
-      <w:r>
-        <w:rPr>
-          <w:sz w:val="24"/>
-          <w:szCs w:val="24"/>
-          <w:rtl w:val="0"/>
-        </w:rPr>
-        <w:t xml:space="preserve">Emitir relatórios consolidados mensais com métricas de produtos mais procurad</w:t>
-      </w:r>
-      <w:r>
-        <w:rPr>
-          <w:b w:val="1"/>
-          <w:bCs w:val="1"/>
-          <w:sz w:val="24"/>
-          <w:szCs w:val="24"/>
-          <w:rtl w:val="0"/>
-        </w:rPr>
-        <w:t xml:space="preserve">O que o sistema NÃO FAZ nesta versão (Escopo Excluído):</w:t>
-      </w:r>
-    </w:p>
-    <w:p>
-      <w:pPr>
-        <w:spacing w:after="240" w:before="240" w:lineRule="auto"/>
-        <w:ind w:left="1440" w:firstLine="0"/>
-        <w:jc w:val="both"/>
-        <w:rPr>
-          <w:sz w:val="24"/>
-          <w:szCs w:val="24"/>
-        </w:rPr>
-      </w:pPr>
-      <w:r>
-        <w:rPr>
-          <w:sz w:val="24"/>
-          <w:szCs w:val="24"/>
-          <w:rtl w:val="0"/>
-        </w:rPr>
-        <w:t xml:space="preserve">[Funcionalidade complexa ou integração externa descontinuada nesta versão inicial]</w:t>
-      </w:r>
-    </w:p>
-    <w:p>
-      <w:pPr>
-        <w:spacing w:after="240" w:before="240" w:lineRule="auto"/>
-        <w:ind w:left="720" w:right="600" w:firstLine="0"/>
-        <w:jc w:val="both"/>
-        <w:rPr>
-          <w:sz w:val="24"/>
-          <w:szCs w:val="24"/>
-        </w:rPr>
-      </w:pPr>
-      <w:r>
-        <w:rPr>
-          <w:b w:val="1"/>
-          <w:bCs w:val="1"/>
-          <w:sz w:val="24"/>
-          <w:szCs w:val="24"/>
-          <w:rtl w:val="0"/>
-        </w:rPr>
-        <w:t xml:space="preserve">O que o sistema NÃO FAZ:</w:t>
-      </w:r>
-      <w:r>
-        <w:rPr>
-          <w:sz w:val="24"/>
-          <w:szCs w:val="24"/>
-          <w:rtl w:val="0"/>
-        </w:rPr>
-        <w:t xml:space="preserve"> Entrega automatizada por drones, programa avançado de fidelidade por pontos e compras corporativas faturadas via boleto bancário.</w:t>
-      </w:r>
-    </w:p>
-    <w:p>
-      <w:pPr>
-        <w:pStyle w:val="Heading2"/>
-        <w:keepNext w:val="0"/>
-        <w:keepLines w:val="0"/>
-        <w:spacing w:after="80" w:lineRule="auto"/>
-        <w:jc w:val="both"/>
-        <w:rPr>
-          <w:b w:val="1"/>
-          <w:bCs w:val="1"/>
-          <w:sz w:val="24"/>
-          <w:szCs w:val="24"/>
-        </w:rPr>
-      </w:pPr>
-      <w:bookmarkStart w:colFirst="0" w:colLast="0" w:name="_mn38ft51gf2s" w:id="9"/>
-      <w:bookmarkEnd w:id="9"/>
-      <w:r>
-        <w:rPr>
-          <w:rtl w:val="0"/>
-        </w:rPr>
-      </w:r>
-    </w:p>
-    <w:p>
-      <w:pPr>
-        <w:pStyle w:val="Heading2"/>
-        <w:keepNext w:val="0"/>
-        <w:keepLines w:val="0"/>
-        <w:spacing w:after="80" w:lineRule="auto"/>
-        <w:jc w:val="both"/>
-        <w:rPr>
-          <w:b w:val="1"/>
-          <w:bCs w:val="1"/>
-          <w:sz w:val="24"/>
-          <w:szCs w:val="24"/>
-        </w:rPr>
-      </w:pPr>
-      <w:bookmarkStart w:colFirst="0" w:colLast="0" w:name="_pbpfzlsrh135" w:id="10"/>
-      <w:bookmarkEnd w:id="10"/>
-      <w:r>
-        <w:rPr>
-          <w:b w:val="1"/>
-          <w:bCs w:val="1"/>
-          <w:sz w:val="24"/>
-          <w:szCs w:val="24"/>
-          <w:rtl w:val="0"/>
-        </w:rPr>
-        <w:t xml:space="preserve">3. Funcionalidades Principais (Requisitos Funcionais - RF)</w:t>
-      </w:r>
-    </w:p>
-    <w:p>
-      <w:pPr>
-        <w:spacing w:after="240" w:before="240" w:lineRule="auto"/>
-        <w:jc w:val="both"/>
-        <w:rPr>
-          <w:sz w:val="24"/>
-          <w:szCs w:val="24"/>
-        </w:rPr>
-      </w:pPr>
-      <w:r>
-        <w:rPr>
-          <w:sz w:val="24"/>
-          <w:szCs w:val="24"/>
-          <w:rtl w:val="0"/>
-        </w:rPr>
-        <w:t xml:space="preserve">Listagem sintética das capacidades do sistema. Todas as frases devem iniciar com um verbo no infinitivo.</w:t>
-      </w:r>
-    </w:p>
-    <w:p>
-      <w:pPr>
-        <w:spacing w:after="240" w:before="240" w:lineRule="auto"/>
-        <w:ind w:left="720" w:firstLine="0"/>
-        <w:jc w:val="both"/>
-        <w:rPr>
-          <w:sz w:val="24"/>
-          <w:szCs w:val="24"/>
-        </w:rPr>
-      </w:pPr>
-      <w:r>
-        <w:rPr>
-          <w:b w:val="1"/>
-          <w:bCs w:val="1"/>
-          <w:sz w:val="24"/>
-          <w:szCs w:val="24"/>
-          <w:rtl w:val="0"/>
-        </w:rPr>
-        <w:t xml:space="preserve">RF01 - Gestão de Cadastro e do Cliente: </w:t>
-      </w:r>
-      <w:r>
-        <w:rPr>
-          <w:sz w:val="24"/>
-          <w:szCs w:val="24"/>
-          <w:rtl w:val="0"/>
-        </w:rPr>
-        <w:t xml:space="preserve">Permitir o cadastro, autenticação e suporte interativo guiado (tutorial/onboarding) para uso intuitivo da plataforma.</w:t>
-      </w:r>
-    </w:p>
-    <w:p>
-      <w:pPr>
-        <w:spacing w:after="240" w:before="240" w:lineRule="auto"/>
-        <w:ind w:left="720" w:firstLine="0"/>
-        <w:jc w:val="both"/>
-        <w:rPr>
-          <w:b w:val="1"/>
-          <w:bCs w:val="1"/>
-          <w:sz w:val="24"/>
-          <w:szCs w:val="24"/>
-        </w:rPr>
-      </w:pPr>
-      <w:r>
-        <w:rPr>
-          <w:b w:val="1"/>
-          <w:bCs w:val="1"/>
-          <w:sz w:val="24"/>
-          <w:szCs w:val="24"/>
-          <w:rtl w:val="0"/>
-        </w:rPr>
-        <w:t xml:space="preserve">RF02 - Gestão de Frete Regional e Internacional: </w:t>
-      </w:r>
-      <w:r>
-        <w:rPr>
-          <w:sz w:val="24"/>
-          <w:szCs w:val="24"/>
-          <w:rtl w:val="0"/>
-        </w:rPr>
-        <w:t xml:space="preserve">Permitir o cálculo dinâmico de fretes com aplicação automática de gratuidades locais/fidelidade e tarifação para envios internacionais.</w:t>
-      </w:r>
-      <w:r>
-        <w:rPr>
-          <w:rtl w:val="0"/>
-        </w:rPr>
-      </w:r>
-    </w:p>
-    <w:p>
-      <w:pPr>
-        <w:spacing w:after="240" w:before="240" w:lineRule="auto"/>
-        <w:ind w:left="720" w:firstLine="0"/>
-        <w:jc w:val="both"/>
-        <w:rPr>
-          <w:b w:val="1"/>
-          <w:bCs w:val="1"/>
-          <w:sz w:val="24"/>
-          <w:szCs w:val="24"/>
-        </w:rPr>
-      </w:pPr>
-      <w:r>
-        <w:rPr>
-          <w:b w:val="1"/>
-          <w:bCs w:val="1"/>
-          <w:sz w:val="24"/>
-          <w:szCs w:val="24"/>
-          <w:rtl w:val="0"/>
-        </w:rPr>
-        <w:t xml:space="preserve">RF03 - M</w:t>
-      </w:r>
-      <w:r>
-        <w:rPr>
-          <w:sz w:val="24"/>
-          <w:szCs w:val="24"/>
-          <w:rtl w:val="0"/>
-        </w:rPr>
-        <w:t xml:space="preserve">os e convertidos para gerentes e administradores.</w:t>
-      </w:r>
-      <w:r>
-        <w:rPr>
-          <w:rtl w:val="0"/>
-        </w:rPr>
-      </w:r>
-    </w:p>
-    <w:p>
-      <w:pPr>
-        <w:spacing w:after="240" w:before="240" w:lineRule="auto"/>
-        <w:ind w:left="720" w:firstLine="0"/>
-        <w:jc w:val="both"/>
-        <w:rPr>
-          <w:sz w:val="24"/>
-          <w:szCs w:val="24"/>
-        </w:rPr>
-      </w:pPr>
-      <w:r>
-        <w:rPr>
-          <w:b w:val="1"/>
-          <w:bCs w:val="1"/>
-          <w:sz w:val="24"/>
-          <w:szCs w:val="24"/>
-          <w:rtl w:val="0"/>
-        </w:rPr>
-        <w:t xml:space="preserve">RF05 - Processamento Multi Moeda e Controle de Estoque: </w:t>
-      </w:r>
-      <w:r>
-        <w:rPr>
-          <w:sz w:val="24"/>
-          <w:szCs w:val="24"/>
-          <w:rtl w:val="0"/>
-        </w:rPr>
-        <w:t xml:space="preserve">Permitir a gestão de inventário de vestuário e converter precificação e totais do carrinho em tempo real para moedas internacionais.</w:t>
-      </w:r>
-    </w:p>
-    <w:p>
-      <w:pPr>
-        <w:spacing w:after="240" w:before="240" w:lineRule="auto"/>
-        <w:ind w:left="720" w:firstLine="0"/>
-        <w:jc w:val="both"/>
-        <w:rPr>
-          <w:sz w:val="24"/>
-          <w:szCs w:val="24"/>
-        </w:rPr>
-      </w:pPr>
-      <w:r>
-        <w:rPr>
-          <w:b w:val="1"/>
-          <w:bCs w:val="1"/>
-          <w:sz w:val="24"/>
-          <w:szCs w:val="24"/>
-          <w:rtl w:val="0"/>
-        </w:rPr>
-        <w:t xml:space="preserve">RF06 - Central de Notificações e Mensageria: </w:t>
-      </w:r>
-      <w:r>
-        <w:rPr>
-          <w:sz w:val="24"/>
-          <w:szCs w:val="24"/>
-          <w:rtl w:val="0"/>
-        </w:rPr>
-        <w:t xml:space="preserve">Disparar mensagens automatizadas para os clientes sobre status de cobrança, novidades de lançamentos e alertas operacionais da loja.</w:t>
-      </w:r>
-    </w:p>
-    <w:p>
-      <w:pPr>
-        <w:spacing w:after="240" w:before="240" w:lineRule="auto"/>
-        <w:ind w:left="720" w:firstLine="0"/>
-        <w:jc w:val="both"/>
-        <w:rPr>
-          <w:sz w:val="24"/>
-          <w:szCs w:val="24"/>
-        </w:rPr>
-      </w:pPr>
-      <w:r>
-        <w:rPr>
-          <w:b w:val="1"/>
-          <w:bCs w:val="1"/>
-          <w:sz w:val="24"/>
-          <w:szCs w:val="24"/>
-          <w:rtl w:val="0"/>
-        </w:rPr>
-        <w:t xml:space="preserve">RF07 - Motor Preditivo de Recomendação Personalizada: </w:t>
-      </w:r>
-      <w:r>
-        <w:rPr>
-          <w:sz w:val="24"/>
-          <w:szCs w:val="24"/>
-          <w:rtl w:val="0"/>
-        </w:rPr>
-        <w:t xml:space="preserve">Sugerir produtos no feed do usuário com base no cruzamento de idade, gênero, preferências de estilo, pesquisas recentes, tamanhos e curtidas.</w:t>
-      </w:r>
-    </w:p>
-    <w:p>
-      <w:pPr>
-        <w:spacing w:after="240" w:before="240" w:lineRule="auto"/>
-        <w:ind w:left="720" w:firstLine="0"/>
-        <w:jc w:val="both"/>
-        <w:rPr>
-          <w:b w:val="1"/>
-          <w:bCs w:val="1"/>
-          <w:sz w:val="24"/>
-          <w:szCs w:val="24"/>
-        </w:rPr>
-      </w:pPr>
-      <w:r>
-        <w:rPr>
-          <w:rtl w:val="0"/>
-        </w:rPr>
-      </w:r>
-    </w:p>
-    <w:p>
-      <w:pPr>
-        <w:spacing w:after="240" w:before="240" w:lineRule="auto"/>
-        <w:ind w:left="720" w:firstLine="0"/>
-        <w:jc w:val="both"/>
-        <w:rPr>
-          <w:b w:val="1"/>
-          <w:bCs w:val="1"/>
-          <w:sz w:val="24"/>
-          <w:szCs w:val="24"/>
-        </w:rPr>
-      </w:pPr>
-      <w:r>
-        <w:rPr>
-          <w:b w:val="1"/>
-          <w:bCs w:val="1"/>
-          <w:sz w:val="24"/>
-          <w:szCs w:val="24"/>
-          <w:rtl w:val="0"/>
-        </w:rPr>
-        <w:t xml:space="preserve">4. Tabela de Requisitos Funcionais e Não-Funcionais</w:t>
-      </w:r>
-    </w:p>
-    <w:p>
-      <w:pPr>
-        <w:pStyle w:val="Heading3"/>
-        <w:keepNext w:val="0"/>
-        <w:keepLines w:val="0"/>
-        <w:spacing w:before="280" w:lineRule="auto"/>
-        <w:jc w:val="both"/>
-        <w:rPr>
-          <w:b w:val="1"/>
-          <w:bCs w:val="1"/>
-          <w:color w:val="000000"/>
-          <w:sz w:val="24"/>
-          <w:szCs w:val="24"/>
-        </w:rPr>
-      </w:pPr>
-      <w:bookmarkStart w:colFirst="0" w:colLast="0" w:name="_qfzf778iwwov" w:id="11"/>
-      <w:bookmarkEnd w:id="11"/>
-      <w:r>
-        <w:rPr>
-          <w:b w:val="1"/>
-          <w:bCs w:val="1"/>
-          <w:color w:val="000000"/>
-          <w:sz w:val="24"/>
-          <w:szCs w:val="24"/>
-          <w:rtl w:val="0"/>
-        </w:rPr>
-        <w:t xml:space="preserve">RF01: Gestão de Cadastro e Onboarding do Cliente</w:t>
       </w:r>
     </w:p>
     <w:p>
@@ -1182,49 +661,18 @@
         <w:ind w:left="720" w:hanging="360"/>
         <w:jc w:val="both"/>
         <w:rPr>
+          <w:sz w:val="24"/>
+          <w:szCs w:val="24"/>
           <w:u w:val="none"/>
         </w:rPr>
       </w:pPr>
       <w:r>
         <w:rPr>
-          <w:b w:val="1"/>
-          <w:bCs w:val="1"/>
-          <w:sz w:val="24"/>
-          <w:szCs w:val="24"/>
-          <w:rtl w:val="0"/>
-        </w:rPr>
-        <w:t xml:space="preserve">Evitante:</w:t>
-      </w:r>
-      <w:r>
-        <w:rPr>
-          <w:sz w:val="24"/>
-          <w:szCs w:val="24"/>
-          <w:rtl w:val="0"/>
-        </w:rPr>
-        <w:t xml:space="preserve"> (X) | </w:t>
-      </w:r>
-      <w:r>
-        <w:rPr>
-          <w:b w:val="1"/>
-          <w:bCs w:val="1"/>
-          <w:sz w:val="24"/>
-          <w:szCs w:val="24"/>
-          <w:rtl w:val="0"/>
-        </w:rPr>
-        <w:t xml:space="preserve">Oculto:</w:t>
-      </w:r>
-      <w:r>
-        <w:rPr>
-          <w:sz w:val="24"/>
-          <w:szCs w:val="24"/>
-          <w:rtl w:val="0"/>
-        </w:rPr>
-        <w:t xml:space="preserve"> ( )</w:t>
-      </w:r>
-      <w:r>
-        <w:rPr>
-          <w:rtl w:val="0"/>
-        </w:rPr>
+          <w:sz w:val="24"/>
+          <w:szCs w:val="24"/>
+          <w:rtl w:val="0"/>
+        </w:rPr>
+        <w:t xml:space="preserve">Cadastro de clientes com Onboarding interativo e perfil de preferências (estilo, tamanho, gênero).</w:t>
       </w:r>
     </w:p>
     <w:p>
@@ -1243,153 +691,11 @@
       </w:pPr>
       <w:r>
         <w:rPr>
-          <w:b w:val="1"/>
-          <w:bCs w:val="1"/>
-          <w:sz w:val="24"/>
-          <w:szCs w:val="24"/>
-          <w:rtl w:val="0"/>
-        </w:rPr>
-        <w:t xml:space="preserve">Descrição:</w:t>
-      </w:r>
-      <w:r>
-        <w:rPr>
-          <w:sz w:val="24"/>
-          <w:szCs w:val="24"/>
-          <w:rtl w:val="0"/>
-        </w:rPr>
-        <w:t xml:space="preserve"> O sistema deve permitir o cadastro do cliente e fornecer um assistente interativo de primeiros passos (Onboarding) para orientar a navegação e compras.</w:t>
-      </w:r>
-    </w:p>
-    <w:p>
-      <w:pPr>
-        <w:numPr>
-          <w:ilvl w:val="0"/>
-          <w:numId w:val="5"/>
-        </w:numPr>
-        <w:spacing w:after="0" w:afterAutospacing="0" w:before="0" w:beforeAutospacing="0" w:lineRule="auto"/>
-        <w:ind w:left="720" w:hanging="360"/>
-        <w:jc w:val="both"/>
-        <w:rPr>
-          <w:sz w:val="24"/>
-          <w:szCs w:val="24"/>
-        </w:rPr>
-      </w:pPr>
-      <w:r>
-        <w:rPr>
-          <w:b w:val="1"/>
-          <w:bCs w:val="1"/>
-          <w:sz w:val="24"/>
-          <w:szCs w:val="24"/>
-          <w:rtl w:val="0"/>
-        </w:rPr>
-        <w:t xml:space="preserve">Categoria:</w:t>
-      </w:r>
-      <w:r>
-        <w:rPr>
-          <w:sz w:val="24"/>
-          <w:szCs w:val="24"/>
-          <w:rtl w:val="0"/>
-        </w:rPr>
-        <w:t xml:space="preserve"> Cadastro e Usabilidade</w:t>
-      </w:r>
-    </w:p>
-    <w:p>
-      <w:pPr>
-        <w:numPr>
-          <w:ilvl w:val="0"/>
-          <w:numId w:val="5"/>
-        </w:numPr>
-        <w:spacing w:after="0" w:afterAutospacing="0" w:before="0" w:beforeAutospacing="0" w:lineRule="auto"/>
-        <w:ind w:left="720" w:hanging="360"/>
-        <w:jc w:val="both"/>
-        <w:rPr>
-          <w:sz w:val="24"/>
-          <w:szCs w:val="24"/>
-        </w:rPr>
-      </w:pPr>
-      <w:r>
-        <w:rPr>
-          <w:b w:val="1"/>
-          <w:bCs w:val="1"/>
-          <w:sz w:val="24"/>
-          <w:szCs w:val="24"/>
-          <w:rtl w:val="0"/>
-        </w:rPr>
-        <w:t xml:space="preserve">Desejável:</w:t>
-      </w:r>
-      <w:r>
-        <w:rPr>
-          <w:sz w:val="24"/>
-          <w:szCs w:val="24"/>
-          <w:rtl w:val="0"/>
-        </w:rPr>
-        <w:t xml:space="preserve"> Não</w:t>
-      </w:r>
-    </w:p>
-    <w:p>
-      <w:pPr>
-        <w:numPr>
-          <w:ilvl w:val="0"/>
-          <w:numId w:val="5"/>
-        </w:numPr>
-        <w:spacing w:after="0" w:afterAutospacing="0" w:before="0" w:beforeAutospacing="0" w:lineRule="auto"/>
-        <w:ind w:left="720" w:hanging="360"/>
-        <w:jc w:val="both"/>
-        <w:rPr>
-          <w:sz w:val="24"/>
-          <w:szCs w:val="24"/>
-        </w:rPr>
-      </w:pPr>
-      <w:r>
-        <w:rPr>
-          <w:b w:val="1"/>
-          <w:bCs w:val="1"/>
-          <w:sz w:val="24"/>
-          <w:szCs w:val="24"/>
-          <w:rtl w:val="0"/>
-        </w:rPr>
-        <w:t xml:space="preserve">Estável:</w:t>
-      </w:r>
-      <w:r>
-        <w:rPr>
-          <w:sz w:val="24"/>
-          <w:szCs w:val="24"/>
-          <w:rtl w:val="0"/>
-        </w:rPr>
-        <w:t xml:space="preserve"> Sim</w:t>
-      </w:r>
-    </w:p>
-    <w:p>
-      <w:pPr>
-        <w:numPr>
-          <w:ilvl w:val="0"/>
-          <w:numId w:val="5"/>
-        </w:numPr>
-        <w:spacing w:after="0" w:afterAutospacing="0" w:before="0" w:beforeAutospacing="0" w:lineRule="auto"/>
-        <w:ind w:left="720" w:hanging="360"/>
-        <w:jc w:val="both"/>
-        <w:rPr>
-          <w:sz w:val="24"/>
-          <w:szCs w:val="24"/>
-        </w:rPr>
-      </w:pPr>
-      <w:r>
-        <w:rPr>
-          <w:b w:val="1"/>
-          <w:bCs w:val="1"/>
-          <w:sz w:val="24"/>
-          <w:szCs w:val="24"/>
-          <w:rtl w:val="0"/>
-        </w:rPr>
-        <w:t xml:space="preserve">RFN 01.01:</w:t>
-      </w:r>
-      <w:r>
-        <w:rPr>
-          <w:sz w:val="24"/>
-          <w:szCs w:val="24"/>
-          <w:rtl w:val="0"/>
-        </w:rPr>
-        <w:t xml:space="preserve"> A edição e alteração de vestimentas no inventário global devem ser restritas exclusivamente aos perfil de Atendente, Gerente ou Administrador.</w:t>
+          <w:sz w:val="24"/>
+          <w:szCs w:val="24"/>
+          <w:rtl w:val="0"/>
+        </w:rPr>
+        <w:t xml:space="preserve">Cálculo automatizado de frete regional e conversão de frete internacional com moedas estrangeiras.</w:t>
       </w:r>
     </w:p>
     <w:p>
@@ -1404,6 +710,700 @@
         <w:rPr>
           <w:sz w:val="24"/>
           <w:szCs w:val="24"/>
+          <w:u w:val="none"/>
+        </w:rPr>
+      </w:pPr>
+      <w:r>
+        <w:rPr>
+          <w:sz w:val="24"/>
+          <w:szCs w:val="24"/>
+          <w:rtl w:val="0"/>
+        </w:rPr>
+        <w:t xml:space="preserve">também ajudará o cliente com o suporte </w:t>
+      </w:r>
+    </w:p>
+    <w:p>
+      <w:pPr>
+        <w:spacing w:after="240" w:before="240" w:lineRule="auto"/>
+        <w:ind w:left="720" w:firstLine="0"/>
+        <w:jc w:val="both"/>
+        <w:rPr>
+          <w:b w:val="1"/>
+          <w:bCs w:val="1"/>
+          <w:sz w:val="24"/>
+          <w:szCs w:val="24"/>
+        </w:rPr>
+      </w:pPr>
+      <w:r>
+        <w:rPr>
+          <w:b w:val="1"/>
+          <w:bCs w:val="1"/>
+          <w:sz w:val="24"/>
+          <w:szCs w:val="24"/>
+          <w:rtl w:val="0"/>
+        </w:rPr>
+        <w:t xml:space="preserve">Moderação e Banimento de Produtos Falsificados: </w:t>
+      </w:r>
+      <w:r>
+        <w:rPr>
+          <w:sz w:val="24"/>
+          <w:szCs w:val="24"/>
+          <w:rtl w:val="0"/>
+        </w:rPr>
+        <w:t xml:space="preserve">Permitir a análise de denúncias, suspensão preventiva e banimento definitivo de anunciantes que comercializarem réplicas ou produtos não originais.</w:t>
+      </w:r>
+      <w:r>
+        <w:rPr>
+          <w:rtl w:val="0"/>
+        </w:rPr>
+      </w:r>
+    </w:p>
+    <w:p>
+      <w:pPr>
+        <w:spacing w:after="240" w:before="240" w:lineRule="auto"/>
+        <w:ind w:left="720" w:firstLine="0"/>
+        <w:jc w:val="both"/>
+        <w:rPr>
+          <w:b w:val="1"/>
+          <w:bCs w:val="1"/>
+          <w:sz w:val="24"/>
+          <w:szCs w:val="24"/>
+        </w:rPr>
+      </w:pPr>
+      <w:r>
+        <w:rPr>
+          <w:b w:val="1"/>
+          <w:bCs w:val="1"/>
+          <w:sz w:val="24"/>
+          <w:szCs w:val="24"/>
+          <w:rtl w:val="0"/>
+        </w:rPr>
+        <w:t xml:space="preserve">RF04 - Geração de Relatórios Analíticos de Tendências: </w:t>
+      </w:r>
+      <w:r>
+        <w:rPr>
+          <w:sz w:val="24"/>
+          <w:szCs w:val="24"/>
+          <w:rtl w:val="0"/>
+        </w:rPr>
+        <w:t xml:space="preserve">Emitir relatórios consolidados mensais com métricas de produtos mais procurad</w:t>
+      </w:r>
+      <w:r>
+        <w:rPr>
+          <w:b w:val="1"/>
+          <w:bCs w:val="1"/>
+          <w:sz w:val="24"/>
+          <w:szCs w:val="24"/>
+          <w:rtl w:val="0"/>
+        </w:rPr>
+        <w:t xml:space="preserve">O que o sistema NÃO FAZ nesta versão (Escopo Excluído):</w:t>
+      </w:r>
+    </w:p>
+    <w:p>
+      <w:pPr>
+        <w:spacing w:after="240" w:before="240" w:lineRule="auto"/>
+        <w:ind w:left="1440" w:firstLine="0"/>
+        <w:jc w:val="both"/>
+        <w:rPr>
+          <w:sz w:val="24"/>
+          <w:szCs w:val="24"/>
+        </w:rPr>
+      </w:pPr>
+      <w:r>
+        <w:rPr>
+          <w:sz w:val="24"/>
+          <w:szCs w:val="24"/>
+          <w:rtl w:val="0"/>
+        </w:rPr>
+        <w:t xml:space="preserve">[Funcionalidade complexa ou integração externa descontinuada nesta versão inicial]</w:t>
+      </w:r>
+    </w:p>
+    <w:p>
+      <w:pPr>
+        <w:spacing w:after="240" w:before="240" w:lineRule="auto"/>
+        <w:ind w:left="720" w:right="600" w:firstLine="0"/>
+        <w:jc w:val="both"/>
+        <w:rPr>
+          <w:sz w:val="24"/>
+          <w:szCs w:val="24"/>
+        </w:rPr>
+      </w:pPr>
+      <w:r>
+        <w:rPr>
+          <w:b w:val="1"/>
+          <w:bCs w:val="1"/>
+          <w:sz w:val="24"/>
+          <w:szCs w:val="24"/>
+          <w:rtl w:val="0"/>
+        </w:rPr>
+        <w:t xml:space="preserve">O que o sistema NÃO FAZ:</w:t>
+      </w:r>
+      <w:r>
+        <w:rPr>
+          <w:sz w:val="24"/>
+          <w:szCs w:val="24"/>
+          <w:rtl w:val="0"/>
+        </w:rPr>
+        <w:t xml:space="preserve"> Entrega automatizada por drones, programa avançado de fidelidade por pontos e compras corporativas faturadas via boleto bancário.</w:t>
+      </w:r>
+    </w:p>
+    <w:p>
+      <w:pPr>
+        <w:pStyle w:val="Heading2"/>
+        <w:keepNext w:val="0"/>
+        <w:keepLines w:val="0"/>
+        <w:spacing w:after="80" w:lineRule="auto"/>
+        <w:jc w:val="both"/>
+        <w:rPr>
+          <w:b w:val="1"/>
+          <w:bCs w:val="1"/>
+          <w:sz w:val="24"/>
+          <w:szCs w:val="24"/>
+        </w:rPr>
+      </w:pPr>
+      <w:bookmarkStart w:colFirst="0" w:colLast="0" w:name="_mn38ft51gf2s" w:id="9"/>
+      <w:bookmarkEnd w:id="9"/>
+      <w:r>
+        <w:rPr>
+          <w:rtl w:val="0"/>
+        </w:rPr>
+      </w:r>
+    </w:p>
+    <w:p>
+      <w:pPr>
+        <w:pStyle w:val="Heading2"/>
+        <w:keepNext w:val="0"/>
+        <w:keepLines w:val="0"/>
+        <w:spacing w:after="80" w:lineRule="auto"/>
+        <w:jc w:val="both"/>
+        <w:rPr>
+          <w:b w:val="1"/>
+          <w:bCs w:val="1"/>
+          <w:sz w:val="24"/>
+          <w:szCs w:val="24"/>
+        </w:rPr>
+      </w:pPr>
+      <w:bookmarkStart w:colFirst="0" w:colLast="0" w:name="_pbpfzlsrh135" w:id="10"/>
+      <w:bookmarkEnd w:id="10"/>
+      <w:r>
+        <w:rPr>
+          <w:b w:val="1"/>
+          <w:bCs w:val="1"/>
+          <w:sz w:val="24"/>
+          <w:szCs w:val="24"/>
+          <w:rtl w:val="0"/>
+        </w:rPr>
+        <w:t xml:space="preserve">3. Funcionalidades Principais (Requisitos Funcionais - RF)</w:t>
+      </w:r>
+    </w:p>
+    <w:p>
+      <w:pPr>
+        <w:spacing w:after="240" w:before="240" w:lineRule="auto"/>
+        <w:jc w:val="both"/>
+        <w:rPr>
+          <w:sz w:val="24"/>
+          <w:szCs w:val="24"/>
+        </w:rPr>
+      </w:pPr>
+      <w:r>
+        <w:rPr>
+          <w:sz w:val="24"/>
+          <w:szCs w:val="24"/>
+          <w:rtl w:val="0"/>
+        </w:rPr>
+        <w:t xml:space="preserve">Listagem sintética das capacidades do sistema. Todas as frases devem iniciar com um verbo no infinitivo.</w:t>
+      </w:r>
+    </w:p>
+    <w:p>
+      <w:pPr>
+        <w:spacing w:after="240" w:before="240" w:lineRule="auto"/>
+        <w:ind w:left="720" w:firstLine="0"/>
+        <w:jc w:val="both"/>
+        <w:rPr>
+          <w:sz w:val="24"/>
+          <w:szCs w:val="24"/>
+        </w:rPr>
+      </w:pPr>
+      <w:r>
+        <w:rPr>
+          <w:b w:val="1"/>
+          <w:bCs w:val="1"/>
+          <w:sz w:val="24"/>
+          <w:szCs w:val="24"/>
+          <w:rtl w:val="0"/>
+        </w:rPr>
+        <w:t xml:space="preserve">RF01 - Gestão de Cadastro e do Cliente: </w:t>
+      </w:r>
+      <w:r>
+        <w:rPr>
+          <w:sz w:val="24"/>
+          <w:szCs w:val="24"/>
+          <w:rtl w:val="0"/>
+        </w:rPr>
+        <w:t xml:space="preserve">Permitir o cadastro, autenticação e suporte interativo guiado (tutorial/onboarding) para uso intuitivo da plataforma.</w:t>
+      </w:r>
+    </w:p>
+    <w:p>
+      <w:pPr>
+        <w:spacing w:after="240" w:before="240" w:lineRule="auto"/>
+        <w:ind w:left="720" w:firstLine="0"/>
+        <w:jc w:val="both"/>
+        <w:rPr>
+          <w:b w:val="1"/>
+          <w:bCs w:val="1"/>
+          <w:sz w:val="24"/>
+          <w:szCs w:val="24"/>
+        </w:rPr>
+      </w:pPr>
+      <w:r>
+        <w:rPr>
+          <w:b w:val="1"/>
+          <w:bCs w:val="1"/>
+          <w:sz w:val="24"/>
+          <w:szCs w:val="24"/>
+          <w:rtl w:val="0"/>
+        </w:rPr>
+        <w:t xml:space="preserve">RF02 - Gestão de Frete Regional e Internacional: </w:t>
+      </w:r>
+      <w:r>
+        <w:rPr>
+          <w:sz w:val="24"/>
+          <w:szCs w:val="24"/>
+          <w:rtl w:val="0"/>
+        </w:rPr>
+        <w:t xml:space="preserve">Permitir o cálculo dinâmico de fretes com aplicação automática de gratuidades locais/fidelidade e tarifação para envios internacionais.</w:t>
+      </w:r>
+      <w:r>
+        <w:rPr>
+          <w:rtl w:val="0"/>
+        </w:rPr>
+      </w:r>
+    </w:p>
+    <w:p>
+      <w:pPr>
+        <w:spacing w:after="240" w:before="240" w:lineRule="auto"/>
+        <w:ind w:left="720" w:firstLine="0"/>
+        <w:jc w:val="both"/>
+        <w:rPr>
+          <w:b w:val="1"/>
+          <w:bCs w:val="1"/>
+          <w:sz w:val="24"/>
+          <w:szCs w:val="24"/>
+        </w:rPr>
+      </w:pPr>
+      <w:r>
+        <w:rPr>
+          <w:b w:val="1"/>
+          <w:bCs w:val="1"/>
+          <w:sz w:val="24"/>
+          <w:szCs w:val="24"/>
+          <w:rtl w:val="0"/>
+        </w:rPr>
+        <w:t xml:space="preserve">RF03 - M</w:t>
+      </w:r>
+      <w:r>
+        <w:rPr>
+          <w:sz w:val="24"/>
+          <w:szCs w:val="24"/>
+          <w:rtl w:val="0"/>
+        </w:rPr>
+        <w:t xml:space="preserve">os e convertidos para gerentes e administradores.</w:t>
+      </w:r>
+      <w:r>
+        <w:rPr>
+          <w:rtl w:val="0"/>
+        </w:rPr>
+      </w:r>
+    </w:p>
+    <w:p>
+      <w:pPr>
+        <w:spacing w:after="240" w:before="240" w:lineRule="auto"/>
+        <w:ind w:left="720" w:firstLine="0"/>
+        <w:jc w:val="both"/>
+        <w:rPr>
+          <w:sz w:val="24"/>
+          <w:szCs w:val="24"/>
+        </w:rPr>
+      </w:pPr>
+      <w:r>
+        <w:rPr>
+          <w:b w:val="1"/>
+          <w:bCs w:val="1"/>
+          <w:sz w:val="24"/>
+          <w:szCs w:val="24"/>
+          <w:rtl w:val="0"/>
+        </w:rPr>
+        <w:t xml:space="preserve">RF05 - Processamento Multi Moeda e Controle de Estoque: </w:t>
+      </w:r>
+      <w:r>
+        <w:rPr>
+          <w:sz w:val="24"/>
+          <w:szCs w:val="24"/>
+          <w:rtl w:val="0"/>
+        </w:rPr>
+        <w:t xml:space="preserve">Permitir a gestão de inventário de vestuário e converter precificação e totais do carrinho em tempo real para moedas internacionais.</w:t>
+      </w:r>
+    </w:p>
+    <w:p>
+      <w:pPr>
+        <w:spacing w:after="240" w:before="240" w:lineRule="auto"/>
+        <w:ind w:left="720" w:firstLine="0"/>
+        <w:jc w:val="both"/>
+        <w:rPr>
+          <w:sz w:val="24"/>
+          <w:szCs w:val="24"/>
+        </w:rPr>
+      </w:pPr>
+      <w:r>
+        <w:rPr>
+          <w:b w:val="1"/>
+          <w:bCs w:val="1"/>
+          <w:sz w:val="24"/>
+          <w:szCs w:val="24"/>
+          <w:rtl w:val="0"/>
+        </w:rPr>
+        <w:t xml:space="preserve">RF06 - Central de Notificações e Mensageria: </w:t>
+      </w:r>
+      <w:r>
+        <w:rPr>
+          <w:sz w:val="24"/>
+          <w:szCs w:val="24"/>
+          <w:rtl w:val="0"/>
+        </w:rPr>
+        <w:t xml:space="preserve">Disparar mensagens automatizadas para os clientes sobre status de cobrança, novidades de lançamentos e alertas operacionais da loja.</w:t>
+      </w:r>
+    </w:p>
+    <w:p>
+      <w:pPr>
+        <w:spacing w:after="240" w:before="240" w:lineRule="auto"/>
+        <w:ind w:left="720" w:firstLine="0"/>
+        <w:jc w:val="both"/>
+        <w:rPr>
+          <w:sz w:val="24"/>
+          <w:szCs w:val="24"/>
+        </w:rPr>
+      </w:pPr>
+      <w:r>
+        <w:rPr>
+          <w:b w:val="1"/>
+          <w:bCs w:val="1"/>
+          <w:sz w:val="24"/>
+          <w:szCs w:val="24"/>
+          <w:rtl w:val="0"/>
+        </w:rPr>
+        <w:t xml:space="preserve">RF07 - Motor Preditivo de Recomendação Personalizada: </w:t>
+      </w:r>
+      <w:r>
+        <w:rPr>
+          <w:sz w:val="24"/>
+          <w:szCs w:val="24"/>
+          <w:rtl w:val="0"/>
+        </w:rPr>
+        <w:t xml:space="preserve">Sugerir produtos no feed do usuário com base no cruzamento de idade, gênero, preferências de estilo, pesquisas recentes, tamanhos e curtidas.</w:t>
+      </w:r>
+    </w:p>
+    <w:p>
+      <w:pPr>
+        <w:spacing w:after="240" w:before="240" w:lineRule="auto"/>
+        <w:ind w:left="720" w:firstLine="0"/>
+        <w:jc w:val="both"/>
+        <w:rPr>
+          <w:b w:val="1"/>
+          <w:bCs w:val="1"/>
+          <w:sz w:val="24"/>
+          <w:szCs w:val="24"/>
+        </w:rPr>
+      </w:pPr>
+      <w:r>
+        <w:rPr>
+          <w:rtl w:val="0"/>
+        </w:rPr>
+      </w:r>
+    </w:p>
+    <w:p>
+      <w:pPr>
+        <w:spacing w:after="240" w:before="240" w:lineRule="auto"/>
+        <w:ind w:left="720" w:firstLine="0"/>
+        <w:jc w:val="both"/>
+        <w:rPr>
+          <w:b w:val="1"/>
+          <w:bCs w:val="1"/>
+          <w:sz w:val="24"/>
+          <w:szCs w:val="24"/>
+        </w:rPr>
+      </w:pPr>
+      <w:r>
+        <w:rPr>
+          <w:b w:val="1"/>
+          <w:bCs w:val="1"/>
+          <w:sz w:val="24"/>
+          <w:szCs w:val="24"/>
+          <w:rtl w:val="0"/>
+        </w:rPr>
+        <w:t xml:space="preserve">4. Tabela de Requisitos Funcionais e Não-Funcionais</w:t>
+      </w:r>
+    </w:p>
+    <w:p>
+      <w:pPr>
+        <w:pStyle w:val="Heading3"/>
+        <w:keepNext w:val="0"/>
+        <w:keepLines w:val="0"/>
+        <w:spacing w:before="280" w:lineRule="auto"/>
+        <w:jc w:val="both"/>
+        <w:rPr>
+          <w:b w:val="1"/>
+          <w:bCs w:val="1"/>
+          <w:color w:val="000000"/>
+          <w:sz w:val="24"/>
+          <w:szCs w:val="24"/>
+        </w:rPr>
+      </w:pPr>
+      <w:bookmarkStart w:colFirst="0" w:colLast="0" w:name="_qfzf778iwwov" w:id="11"/>
+      <w:bookmarkEnd w:id="11"/>
+      <w:r>
+        <w:rPr>
+          <w:b w:val="1"/>
+          <w:bCs w:val="1"/>
+          <w:color w:val="000000"/>
+          <w:sz w:val="24"/>
+          <w:szCs w:val="24"/>
+          <w:rtl w:val="0"/>
+        </w:rPr>
+        <w:t xml:space="preserve">RF01: Gestão de Cadastro e Onboarding do Cliente</w:t>
+      </w:r>
+    </w:p>
+    <w:p>
+      <w:pPr>
+        <w:numPr>
+          <w:ilvl w:val="0"/>
+          <w:numId w:val="7"/>
+        </w:numPr>
+        <w:spacing w:after="0" w:afterAutospacing="0" w:before="240" w:lineRule="auto"/>
+        <w:ind w:left="720" w:hanging="360"/>
+        <w:jc w:val="both"/>
+        <w:rPr>
+          <w:u w:val="none"/>
+        </w:rPr>
+      </w:pPr>
+      <w:r>
+        <w:rPr>
+          <w:b w:val="1"/>
+          <w:bCs w:val="1"/>
+          <w:sz w:val="24"/>
+          <w:szCs w:val="24"/>
+          <w:rtl w:val="0"/>
+        </w:rPr>
+        <w:t xml:space="preserve">Evitante:</w:t>
+      </w:r>
+      <w:r>
+        <w:rPr>
+          <w:sz w:val="24"/>
+          <w:szCs w:val="24"/>
+          <w:rtl w:val="0"/>
+        </w:rPr>
+        <w:t xml:space="preserve"> (X) | </w:t>
+      </w:r>
+      <w:r>
+        <w:rPr>
+          <w:b w:val="1"/>
+          <w:bCs w:val="1"/>
+          <w:sz w:val="24"/>
+          <w:szCs w:val="24"/>
+          <w:rtl w:val="0"/>
+        </w:rPr>
+        <w:t xml:space="preserve">Oculto:</w:t>
+      </w:r>
+      <w:r>
+        <w:rPr>
+          <w:sz w:val="24"/>
+          <w:szCs w:val="24"/>
+          <w:rtl w:val="0"/>
+        </w:rPr>
+        <w:t xml:space="preserve"> ( )</w:t>
+      </w:r>
+      <w:r>
+        <w:rPr>
+          <w:rtl w:val="0"/>
+        </w:rPr>
+      </w:r>
+    </w:p>
+    <w:p>
+      <w:pPr>
+        <w:numPr>
+          <w:ilvl w:val="0"/>
+          <w:numId w:val="7"/>
+        </w:numPr>
+        <w:spacing w:after="0" w:afterAutospacing="0" w:before="0" w:beforeAutospacing="0" w:lineRule="auto"/>
+        <w:ind w:left="720" w:hanging="360"/>
+        <w:jc w:val="both"/>
+        <w:rPr>
+          <w:sz w:val="24"/>
+          <w:szCs w:val="24"/>
+        </w:rPr>
+      </w:pPr>
+      <w:r>
+        <w:rPr>
+          <w:b w:val="1"/>
+          <w:bCs w:val="1"/>
+          <w:sz w:val="24"/>
+          <w:szCs w:val="24"/>
+          <w:rtl w:val="0"/>
+        </w:rPr>
+        <w:t xml:space="preserve">Descrição:</w:t>
+      </w:r>
+      <w:r>
+        <w:rPr>
+          <w:sz w:val="24"/>
+          <w:szCs w:val="24"/>
+          <w:rtl w:val="0"/>
+        </w:rPr>
+        <w:t xml:space="preserve"> O sistema deve permitir o cadastro do cliente e fornecer um assistente interativo de primeiros passos (Onboarding) para orientar a navegação e compras.</w:t>
+      </w:r>
+    </w:p>
+    <w:p>
+      <w:pPr>
+        <w:numPr>
+          <w:ilvl w:val="0"/>
+          <w:numId w:val="7"/>
+        </w:numPr>
+        <w:spacing w:after="0" w:afterAutospacing="0" w:before="0" w:beforeAutospacing="0" w:lineRule="auto"/>
+        <w:ind w:left="720" w:hanging="360"/>
+        <w:jc w:val="both"/>
+        <w:rPr>
+          <w:sz w:val="24"/>
+          <w:szCs w:val="24"/>
+        </w:rPr>
+      </w:pPr>
+      <w:r>
+        <w:rPr>
+          <w:b w:val="1"/>
+          <w:bCs w:val="1"/>
+          <w:sz w:val="24"/>
+          <w:szCs w:val="24"/>
+          <w:rtl w:val="0"/>
+        </w:rPr>
+        <w:t xml:space="preserve">Categoria:</w:t>
+      </w:r>
+      <w:r>
+        <w:rPr>
+          <w:sz w:val="24"/>
+          <w:szCs w:val="24"/>
+          <w:rtl w:val="0"/>
+        </w:rPr>
+        <w:t xml:space="preserve"> Cadastro e Usabilidade</w:t>
+      </w:r>
+    </w:p>
+    <w:p>
+      <w:pPr>
+        <w:numPr>
+          <w:ilvl w:val="0"/>
+          <w:numId w:val="7"/>
+        </w:numPr>
+        <w:spacing w:after="0" w:afterAutospacing="0" w:before="0" w:beforeAutospacing="0" w:lineRule="auto"/>
+        <w:ind w:left="720" w:hanging="360"/>
+        <w:jc w:val="both"/>
+        <w:rPr>
+          <w:sz w:val="24"/>
+          <w:szCs w:val="24"/>
+        </w:rPr>
+      </w:pPr>
+      <w:r>
+        <w:rPr>
+          <w:b w:val="1"/>
+          <w:bCs w:val="1"/>
+          <w:sz w:val="24"/>
+          <w:szCs w:val="24"/>
+          <w:rtl w:val="0"/>
+        </w:rPr>
+        <w:t xml:space="preserve">Desejável:</w:t>
+      </w:r>
+      <w:r>
+        <w:rPr>
+          <w:sz w:val="24"/>
+          <w:szCs w:val="24"/>
+          <w:rtl w:val="0"/>
+        </w:rPr>
+        <w:t xml:space="preserve"> Não</w:t>
+      </w:r>
+    </w:p>
+    <w:p>
+      <w:pPr>
+        <w:numPr>
+          <w:ilvl w:val="0"/>
+          <w:numId w:val="7"/>
+        </w:numPr>
+        <w:spacing w:after="0" w:afterAutospacing="0" w:before="0" w:beforeAutospacing="0" w:lineRule="auto"/>
+        <w:ind w:left="720" w:hanging="360"/>
+        <w:jc w:val="both"/>
+        <w:rPr>
+          <w:sz w:val="24"/>
+          <w:szCs w:val="24"/>
+        </w:rPr>
+      </w:pPr>
+      <w:r>
+        <w:rPr>
+          <w:b w:val="1"/>
+          <w:bCs w:val="1"/>
+          <w:sz w:val="24"/>
+          <w:szCs w:val="24"/>
+          <w:rtl w:val="0"/>
+        </w:rPr>
+        <w:t xml:space="preserve">Estável:</w:t>
+      </w:r>
+      <w:r>
+        <w:rPr>
+          <w:sz w:val="24"/>
+          <w:szCs w:val="24"/>
+          <w:rtl w:val="0"/>
+        </w:rPr>
+        <w:t xml:space="preserve"> Sim</w:t>
+      </w:r>
+    </w:p>
+    <w:p>
+      <w:pPr>
+        <w:numPr>
+          <w:ilvl w:val="0"/>
+          <w:numId w:val="7"/>
+        </w:numPr>
+        <w:spacing w:after="0" w:afterAutospacing="0" w:before="0" w:beforeAutospacing="0" w:lineRule="auto"/>
+        <w:ind w:left="720" w:hanging="360"/>
+        <w:jc w:val="both"/>
+        <w:rPr>
+          <w:sz w:val="24"/>
+          <w:szCs w:val="24"/>
+        </w:rPr>
+      </w:pPr>
+      <w:r>
+        <w:rPr>
+          <w:b w:val="1"/>
+          <w:bCs w:val="1"/>
+          <w:sz w:val="24"/>
+          <w:szCs w:val="24"/>
+          <w:rtl w:val="0"/>
+        </w:rPr>
+        <w:t xml:space="preserve">RFN 01.01:</w:t>
+      </w:r>
+      <w:r>
+        <w:rPr>
+          <w:sz w:val="24"/>
+          <w:szCs w:val="24"/>
+          <w:rtl w:val="0"/>
+        </w:rPr>
+        <w:t xml:space="preserve"> A edição e alteração de vestimentas no inventário global devem ser restritas exclusivamente aos perfil de Atendente, Gerente ou Administrador.</w:t>
+      </w:r>
+    </w:p>
+    <w:p>
+      <w:pPr>
+        <w:numPr>
+          <w:ilvl w:val="0"/>
+          <w:numId w:val="7"/>
+        </w:numPr>
+        <w:spacing w:after="240" w:before="0" w:beforeAutospacing="0" w:lineRule="auto"/>
+        <w:ind w:left="720" w:hanging="360"/>
+        <w:jc w:val="both"/>
+        <w:rPr>
+          <w:sz w:val="24"/>
+          <w:szCs w:val="24"/>
         </w:rPr>
       </w:pPr>
       <w:r>
@@ -1754,7 +1754,7 @@
         <w:keepLines w:val="0"/>
         <w:numPr>
           <w:ilvl w:val="0"/>
-          <w:numId w:val="4"/>
+          <w:numId w:val="6"/>
         </w:numPr>
         <w:spacing w:after="0" w:afterAutospacing="0" w:before="280" w:lineRule="auto"/>
         <w:ind w:left="720" w:hanging="360"/>
@@ -1808,7 +1808,7 @@
       <w:pPr>
         <w:numPr>
           <w:ilvl w:val="0"/>
-          <w:numId w:val="4"/>
+          <w:numId w:val="6"/>
         </w:numPr>
         <w:spacing w:after="0" w:afterAutospacing="0" w:before="0" w:beforeAutospacing="0" w:lineRule="auto"/>
         <w:ind w:left="720" w:hanging="360"/>
@@ -1841,7 +1841,7 @@
       <w:pPr>
         <w:numPr>
           <w:ilvl w:val="0"/>
-          <w:numId w:val="4"/>
+          <w:numId w:val="6"/>
         </w:numPr>
         <w:spacing w:after="0" w:afterAutospacing="0" w:before="0" w:beforeAutospacing="0" w:lineRule="auto"/>
         <w:ind w:left="720" w:hanging="360"/>
@@ -1874,7 +1874,7 @@
       <w:pPr>
         <w:numPr>
           <w:ilvl w:val="0"/>
-          <w:numId w:val="4"/>
+          <w:numId w:val="6"/>
         </w:numPr>
         <w:spacing w:after="0" w:afterAutospacing="0" w:before="0" w:beforeAutospacing="0" w:lineRule="auto"/>
         <w:ind w:left="720" w:hanging="360"/>
@@ -1907,7 +1907,7 @@
       <w:pPr>
         <w:numPr>
           <w:ilvl w:val="0"/>
-          <w:numId w:val="4"/>
+          <w:numId w:val="6"/>
         </w:numPr>
         <w:spacing w:after="0" w:afterAutospacing="0" w:before="0" w:beforeAutospacing="0" w:lineRule="auto"/>
         <w:ind w:left="720" w:hanging="360"/>
@@ -1940,7 +1940,7 @@
       <w:pPr>
         <w:numPr>
           <w:ilvl w:val="0"/>
-          <w:numId w:val="4"/>
+          <w:numId w:val="6"/>
         </w:numPr>
         <w:spacing w:after="0" w:afterAutospacing="0" w:before="0" w:beforeAutospacing="0" w:lineRule="auto"/>
         <w:ind w:left="720" w:hanging="360"/>
@@ -1973,7 +1973,7 @@
       <w:pPr>
         <w:numPr>
           <w:ilvl w:val="0"/>
-          <w:numId w:val="4"/>
+          <w:numId w:val="6"/>
         </w:numPr>
         <w:spacing w:after="240" w:before="0" w:beforeAutospacing="0" w:lineRule="auto"/>
         <w:ind w:left="720" w:hanging="360"/>
@@ -2049,7 +2049,7 @@
         <w:keepLines w:val="0"/>
         <w:numPr>
           <w:ilvl w:val="0"/>
-          <w:numId w:val="4"/>
+          <w:numId w:val="6"/>
         </w:numPr>
         <w:spacing w:after="0" w:afterAutospacing="0" w:before="280" w:lineRule="auto"/>
         <w:ind w:left="720" w:hanging="360"/>
@@ -2103,7 +2103,7 @@
       <w:pPr>
         <w:numPr>
           <w:ilvl w:val="0"/>
-          <w:numId w:val="4"/>
+          <w:numId w:val="6"/>
         </w:numPr>
         <w:spacing w:after="0" w:afterAutospacing="0" w:before="0" w:beforeAutospacing="0" w:lineRule="auto"/>
         <w:ind w:left="720" w:hanging="360"/>
@@ -2136,7 +2136,7 @@
       <w:pPr>
         <w:numPr>
           <w:ilvl w:val="0"/>
-          <w:numId w:val="4"/>
+          <w:numId w:val="6"/>
         </w:numPr>
         <w:spacing w:after="0" w:afterAutospacing="0" w:before="0" w:beforeAutospacing="0" w:lineRule="auto"/>
         <w:ind w:left="720" w:hanging="360"/>
@@ -2171,7 +2171,7 @@
       <w:pPr>
         <w:numPr>
           <w:ilvl w:val="0"/>
-          <w:numId w:val="4"/>
+          <w:numId w:val="6"/>
         </w:numPr>
         <w:spacing w:after="0" w:afterAutospacing="0" w:before="0" w:beforeAutospacing="0" w:lineRule="auto"/>
         <w:ind w:left="720" w:hanging="360"/>
@@ -2204,7 +2204,7 @@
       <w:pPr>
         <w:numPr>
           <w:ilvl w:val="0"/>
-          <w:numId w:val="4"/>
+          <w:numId w:val="6"/>
         </w:numPr>
         <w:spacing w:after="0" w:afterAutospacing="0" w:before="0" w:beforeAutospacing="0" w:lineRule="auto"/>
         <w:ind w:left="720" w:hanging="360"/>
@@ -2237,7 +2237,7 @@
       <w:pPr>
         <w:numPr>
           <w:ilvl w:val="0"/>
-          <w:numId w:val="4"/>
+          <w:numId w:val="6"/>
         </w:numPr>
         <w:spacing w:after="0" w:afterAutospacing="0" w:before="0" w:beforeAutospacing="0" w:lineRule="auto"/>
         <w:ind w:left="720" w:hanging="360"/>
@@ -2272,7 +2272,7 @@
       <w:pPr>
         <w:numPr>
           <w:ilvl w:val="0"/>
-          <w:numId w:val="4"/>
+          <w:numId w:val="6"/>
         </w:numPr>
         <w:spacing w:after="240" w:before="0" w:beforeAutospacing="0" w:lineRule="auto"/>
         <w:ind w:left="720" w:hanging="360"/>
@@ -2333,7 +2333,7 @@
         <w:keepLines w:val="0"/>
         <w:numPr>
           <w:ilvl w:val="0"/>
-          <w:numId w:val="4"/>
+          <w:numId w:val="6"/>
         </w:numPr>
         <w:spacing w:after="0" w:afterAutospacing="0" w:before="280" w:lineRule="auto"/>
         <w:ind w:left="720" w:hanging="360"/>
@@ -2387,7 +2387,7 @@
       <w:pPr>
         <w:numPr>
           <w:ilvl w:val="0"/>
-          <w:numId w:val="4"/>
+          <w:numId w:val="6"/>
         </w:numPr>
         <w:ind w:left="720" w:hanging="360"/>
       </w:pPr>
@@ -2420,7 +2420,7 @@
       <w:pPr>
         <w:numPr>
           <w:ilvl w:val="0"/>
-          <w:numId w:val="4"/>
+          <w:numId w:val="6"/>
         </w:numPr>
         <w:spacing w:after="0" w:afterAutospacing="0"/>
         <w:ind w:left="720" w:hanging="360"/>
@@ -2454,7 +2454,7 @@
       <w:pPr>
         <w:numPr>
           <w:ilvl w:val="0"/>
-          <w:numId w:val="4"/>
+          <w:numId w:val="6"/>
         </w:numPr>
         <w:spacing w:after="0" w:afterAutospacing="0" w:before="0" w:beforeAutospacing="0" w:lineRule="auto"/>
         <w:ind w:left="720" w:hanging="360"/>
@@ -2487,7 +2487,7 @@
       <w:pPr>
         <w:numPr>
           <w:ilvl w:val="0"/>
-          <w:numId w:val="4"/>
+          <w:numId w:val="6"/>
         </w:numPr>
         <w:spacing w:after="0" w:afterAutospacing="0" w:before="0" w:beforeAutospacing="0" w:lineRule="auto"/>
         <w:ind w:left="720" w:hanging="360"/>
@@ -2520,7 +2520,7 @@
       <w:pPr>
         <w:numPr>
           <w:ilvl w:val="0"/>
-          <w:numId w:val="4"/>
+          <w:numId w:val="6"/>
         </w:numPr>
         <w:ind w:left="720" w:hanging="360"/>
         <w:rPr>
@@ -2558,7 +2558,7 @@
       <w:pPr>
         <w:numPr>
           <w:ilvl w:val="0"/>
-          <w:numId w:val="4"/>
+          <w:numId w:val="6"/>
         </w:numPr>
         <w:ind w:left="720" w:hanging="360"/>
         <w:rPr>
@@ -2629,7 +2629,7 @@
         <w:keepLines w:val="0"/>
         <w:numPr>
           <w:ilvl w:val="0"/>
-          <w:numId w:val="4"/>
+          <w:numId w:val="6"/>
         </w:numPr>
         <w:spacing w:after="0" w:afterAutospacing="0" w:before="280" w:lineRule="auto"/>
         <w:ind w:left="720" w:hanging="360"/>
@@ -2683,7 +2683,7 @@
       <w:pPr>
         <w:numPr>
           <w:ilvl w:val="0"/>
-          <w:numId w:val="4"/>
+          <w:numId w:val="6"/>
         </w:numPr>
         <w:ind w:left="720" w:hanging="360"/>
       </w:pPr>
@@ -2721,7 +2721,7 @@
       <w:pPr>
         <w:numPr>
           <w:ilvl w:val="0"/>
-          <w:numId w:val="4"/>
+          <w:numId w:val="6"/>
         </w:numPr>
         <w:ind w:left="720" w:hanging="360"/>
         <w:rPr>
@@ -2760,7 +2760,7 @@
       <w:pPr>
         <w:numPr>
           <w:ilvl w:val="0"/>
-          <w:numId w:val="4"/>
+          <w:numId w:val="6"/>
         </w:numPr>
         <w:spacing w:after="0" w:afterAutospacing="0"/>
         <w:ind w:left="720" w:hanging="360"/>
@@ -2794,7 +2794,7 @@
       <w:pPr>
         <w:numPr>
           <w:ilvl w:val="0"/>
-          <w:numId w:val="4"/>
+          <w:numId w:val="6"/>
         </w:numPr>
         <w:spacing w:after="0" w:afterAutospacing="0" w:before="0" w:beforeAutospacing="0" w:lineRule="auto"/>
         <w:ind w:left="720" w:hanging="360"/>
@@ -2827,7 +2827,7 @@
       <w:pPr>
         <w:numPr>
           <w:ilvl w:val="0"/>
-          <w:numId w:val="4"/>
+          <w:numId w:val="6"/>
         </w:numPr>
         <w:ind w:left="720" w:hanging="360"/>
         <w:rPr>
@@ -2860,7 +2860,7 @@
       <w:pPr>
         <w:numPr>
           <w:ilvl w:val="0"/>
-          <w:numId w:val="4"/>
+          <w:numId w:val="6"/>
         </w:numPr>
         <w:ind w:left="720" w:hanging="360"/>
         <w:rPr>
@@ -2929,7 +2929,7 @@
         <w:keepLines w:val="0"/>
         <w:numPr>
           <w:ilvl w:val="0"/>
-          <w:numId w:val="4"/>
+          <w:numId w:val="6"/>
         </w:numPr>
         <w:spacing w:after="0" w:afterAutospacing="0" w:before="280" w:lineRule="auto"/>
         <w:ind w:left="720" w:hanging="360"/>
@@ -2983,7 +2983,7 @@
       <w:pPr>
         <w:numPr>
           <w:ilvl w:val="0"/>
-          <w:numId w:val="4"/>
+          <w:numId w:val="6"/>
         </w:numPr>
         <w:ind w:left="720" w:hanging="360"/>
       </w:pPr>
@@ -3016,7 +3016,7 @@
       <w:pPr>
         <w:numPr>
           <w:ilvl w:val="0"/>
-          <w:numId w:val="4"/>
+          <w:numId w:val="6"/>
         </w:numPr>
         <w:ind w:left="720" w:hanging="360"/>
       </w:pPr>
@@ -3043,7 +3043,7 @@
       <w:pPr>
         <w:numPr>
           <w:ilvl w:val="0"/>
-          <w:numId w:val="4"/>
+          <w:numId w:val="6"/>
         </w:numPr>
         <w:spacing w:after="0" w:afterAutospacing="0"/>
         <w:ind w:left="720" w:hanging="360"/>
@@ -3071,7 +3071,7 @@
       <w:pPr>
         <w:numPr>
           <w:ilvl w:val="0"/>
-          <w:numId w:val="4"/>
+          <w:numId w:val="6"/>
         </w:numPr>
         <w:spacing w:after="0" w:afterAutospacing="0" w:before="0" w:beforeAutospacing="0" w:lineRule="auto"/>
         <w:ind w:left="720" w:hanging="360"/>
@@ -3106,7 +3106,7 @@
       <w:pPr>
         <w:numPr>
           <w:ilvl w:val="0"/>
-          <w:numId w:val="4"/>
+          <w:numId w:val="6"/>
         </w:numPr>
         <w:spacing w:after="240" w:before="0" w:beforeAutospacing="0" w:lineRule="auto"/>
         <w:ind w:left="720" w:hanging="360"/>
@@ -5373,7 +5373,7 @@
                 <w:szCs w:val="24"/>
                 <w:rtl w:val="0"/>
               </w:rPr>
-              <w:t xml:space="preserve">RF03 - Moderação e Banimento de Produtos Falsificados</w:t>
+              <w:t xml:space="preserve">RF03 - Nos convertidos para gerentes e administradores.</w:t>
             </w:r>
           </w:p>
         </w:tc>
@@ -5490,7 +5490,7 @@
                 <w:szCs w:val="24"/>
                 <w:rtl w:val="0"/>
               </w:rPr>
-              <w:t xml:space="preserve">O sistema deve monitorar e permitir a suspensão temporária ou banimento definitivo de anunciantes flagrados comercializando produtos não originais.</w:t>
+              <w:t xml:space="preserve">O sistema deve monitorar e permitir a suspensão temporária de anúncios/anunciantes ou o banimento definitivo de anunciantes flagrados comercializando produtos falsificados.</w:t>
             </w:r>
           </w:p>
         </w:tc>
@@ -5972,7 +5972,7 @@
             <w:pPr>
               <w:widowControl w:val="0"/>
               <w:spacing w:line="240" w:lineRule="auto"/>
-              <w:jc w:val="center"/>
+              <w:jc w:val="left"/>
               <w:rPr>
                 <w:b w:val="1"/>
                 <w:bCs w:val="1"/>
@@ -8569,7 +8569,7 @@
               <w:widowControl w:val="0"/>
               <w:numPr>
                 <w:ilvl w:val="0"/>
-                <w:numId w:val="7"/>
+                <w:numId w:val="10"/>
               </w:numPr>
               <w:spacing w:line="240" w:lineRule="auto"/>
               <w:ind w:left="720" w:hanging="360"/>
@@ -8618,7 +8618,7 @@
               <w:widowControl w:val="0"/>
               <w:numPr>
                 <w:ilvl w:val="0"/>
-                <w:numId w:val="7"/>
+                <w:numId w:val="10"/>
               </w:numPr>
               <w:spacing w:line="240" w:lineRule="auto"/>
               <w:ind w:left="720" w:hanging="360"/>
@@ -8756,7 +8756,7 @@
               <w:widowControl w:val="0"/>
               <w:numPr>
                 <w:ilvl w:val="0"/>
-                <w:numId w:val="6"/>
+                <w:numId w:val="9"/>
               </w:numPr>
               <w:spacing w:line="240" w:lineRule="auto"/>
               <w:ind w:left="720" w:hanging="360"/>
@@ -8805,7 +8805,7 @@
               <w:widowControl w:val="0"/>
               <w:numPr>
                 <w:ilvl w:val="0"/>
-                <w:numId w:val="6"/>
+                <w:numId w:val="9"/>
               </w:numPr>
               <w:spacing w:line="240" w:lineRule="auto"/>
               <w:ind w:left="720" w:hanging="360"/>
@@ -8890,7 +8890,7 @@
               <w:widowControl w:val="0"/>
               <w:numPr>
                 <w:ilvl w:val="0"/>
-                <w:numId w:val="2"/>
+                <w:numId w:val="4"/>
               </w:numPr>
               <w:spacing w:line="240" w:lineRule="auto"/>
               <w:ind w:left="720" w:hanging="360"/>
@@ -8907,7 +8907,7 @@
                 <w:szCs w:val="24"/>
                 <w:rtl w:val="0"/>
               </w:rPr>
-              <w:t xml:space="preserve">RN03</w:t>
+              <w:t xml:space="preserve">RN02</w:t>
             </w:r>
             <w:r>
               <w:rPr>
@@ -8923,6 +8923,871 @@
               <w:widowControl w:val="0"/>
               <w:spacing w:line="240" w:lineRule="auto"/>
               <w:ind w:left="720" w:firstLine="0"/>
+              <w:rPr>
+                <w:sz w:val="24"/>
+                <w:szCs w:val="24"/>
+              </w:rPr>
+            </w:pPr>
+            <w:r>
+              <w:rPr>
+                <w:rtl w:val="0"/>
+              </w:rPr>
+            </w:r>
+          </w:p>
+          <w:p>
+            <w:pPr>
+              <w:widowControl w:val="0"/>
+              <w:numPr>
+                <w:ilvl w:val="0"/>
+                <w:numId w:val="4"/>
+              </w:numPr>
+              <w:spacing w:line="240" w:lineRule="auto"/>
+              <w:ind w:left="720" w:hanging="360"/>
+              <w:rPr>
+                <w:b w:val="1"/>
+                <w:bCs w:val="1"/>
+                <w:sz w:val="24"/>
+                <w:szCs w:val="24"/>
+              </w:rPr>
+            </w:pPr>
+            <w:r>
+              <w:rPr>
+                <w:b w:val="1"/>
+                <w:bCs w:val="1"/>
+                <w:sz w:val="24"/>
+                <w:szCs w:val="24"/>
+                <w:rtl w:val="0"/>
+              </w:rPr>
+              <w:t xml:space="preserve">RF01</w:t>
+            </w:r>
+          </w:p>
+        </w:tc>
+      </w:tr>
+    </w:tbl>
+    <w:p>
+      <w:pPr>
+        <w:spacing w:line="360" w:lineRule="auto"/>
+        <w:jc w:val="both"/>
+        <w:rPr/>
+      </w:pPr>
+      <w:r>
+        <w:rPr>
+          <w:rtl w:val="0"/>
+        </w:rPr>
+      </w:r>
+    </w:p>
+    <w:p>
+      <w:pPr>
+        <w:spacing w:line="360" w:lineRule="auto"/>
+        <w:jc w:val="both"/>
+        <w:rPr/>
+      </w:pPr>
+      <w:r>
+        <w:rPr>
+          <w:rtl w:val="0"/>
+        </w:rPr>
+      </w:r>
+    </w:p>
+    <w:p>
+      <w:pPr>
+        <w:spacing w:line="360" w:lineRule="auto"/>
+        <w:jc w:val="both"/>
+        <w:rPr/>
+      </w:pPr>
+      <w:r>
+        <w:rPr>
+          <w:rtl w:val="0"/>
+        </w:rPr>
+      </w:r>
+    </w:p>
+    <w:p>
+      <w:pPr>
+        <w:spacing w:line="360" w:lineRule="auto"/>
+        <w:jc w:val="both"/>
+        <w:rPr/>
+      </w:pPr>
+      <w:r>
+        <w:rPr>
+          <w:rtl w:val="0"/>
+        </w:rPr>
+      </w:r>
+    </w:p>
+    <w:p>
+      <w:pPr>
+        <w:spacing w:line="360" w:lineRule="auto"/>
+        <w:jc w:val="both"/>
+        <w:rPr/>
+      </w:pPr>
+      <w:r>
+        <w:rPr>
+          <w:rtl w:val="0"/>
+        </w:rPr>
+      </w:r>
+    </w:p>
+    <w:p>
+      <w:pPr>
+        <w:spacing w:line="360" w:lineRule="auto"/>
+        <w:jc w:val="both"/>
+        <w:rPr/>
+      </w:pPr>
+      <w:r>
+        <w:rPr>
+          <w:rtl w:val="0"/>
+        </w:rPr>
+      </w:r>
+    </w:p>
+    <w:p>
+      <w:pPr>
+        <w:spacing w:line="360" w:lineRule="auto"/>
+        <w:jc w:val="both"/>
+        <w:rPr/>
+      </w:pPr>
+      <w:r>
+        <w:rPr>
+          <w:rtl w:val="0"/>
+        </w:rPr>
+      </w:r>
+    </w:p>
+    <w:p>
+      <w:pPr>
+        <w:spacing w:line="360" w:lineRule="auto"/>
+        <w:jc w:val="both"/>
+        <w:rPr/>
+      </w:pPr>
+      <w:r>
+        <w:rPr>
+          <w:rtl w:val="0"/>
+        </w:rPr>
+      </w:r>
+    </w:p>
+    <w:p>
+      <w:pPr>
+        <w:spacing w:line="360" w:lineRule="auto"/>
+        <w:jc w:val="both"/>
+        <w:rPr/>
+      </w:pPr>
+      <w:r>
+        <w:rPr>
+          <w:rtl w:val="0"/>
+        </w:rPr>
+      </w:r>
+    </w:p>
+    <w:p>
+      <w:pPr>
+        <w:spacing w:line="360" w:lineRule="auto"/>
+        <w:jc w:val="both"/>
+        <w:rPr/>
+      </w:pPr>
+      <w:r>
+        <w:rPr>
+          <w:rtl w:val="0"/>
+        </w:rPr>
+      </w:r>
+    </w:p>
+    <w:p>
+      <w:pPr>
+        <w:spacing w:line="360" w:lineRule="auto"/>
+        <w:jc w:val="both"/>
+        <w:rPr/>
+      </w:pPr>
+      <w:r>
+        <w:rPr>
+          <w:rtl w:val="0"/>
+        </w:rPr>
+      </w:r>
+    </w:p>
+    <w:p>
+      <w:pPr>
+        <w:spacing w:line="360" w:lineRule="auto"/>
+        <w:jc w:val="both"/>
+        <w:rPr/>
+      </w:pPr>
+      <w:r>
+        <w:rPr>
+          <w:rtl w:val="0"/>
+        </w:rPr>
+      </w:r>
+    </w:p>
+    <w:p>
+      <w:pPr>
+        <w:spacing w:line="360" w:lineRule="auto"/>
+        <w:jc w:val="both"/>
+        <w:rPr/>
+      </w:pPr>
+      <w:r>
+        <w:rPr>
+          <w:rtl w:val="0"/>
+        </w:rPr>
+      </w:r>
+    </w:p>
+    <w:p>
+      <w:pPr>
+        <w:spacing w:line="360" w:lineRule="auto"/>
+        <w:jc w:val="both"/>
+        <w:rPr/>
+      </w:pPr>
+      <w:r>
+        <w:rPr>
+          <w:rtl w:val="0"/>
+        </w:rPr>
+      </w:r>
+    </w:p>
+    <w:p>
+      <w:pPr>
+        <w:spacing w:line="360" w:lineRule="auto"/>
+        <w:jc w:val="both"/>
+        <w:rPr/>
+      </w:pPr>
+      <w:r>
+        <w:rPr>
+          <w:rtl w:val="0"/>
+        </w:rPr>
+      </w:r>
+    </w:p>
+    <w:p>
+      <w:pPr>
+        <w:spacing w:line="360" w:lineRule="auto"/>
+        <w:jc w:val="both"/>
+        <w:rPr>
+          <w:sz w:val="24"/>
+          <w:szCs w:val="24"/>
+        </w:rPr>
+      </w:pPr>
+      <w:r>
+        <w:rPr>
+          <w:sz w:val="24"/>
+          <w:szCs w:val="24"/>
+          <w:rtl w:val="0"/>
+        </w:rPr>
+        <w:t xml:space="preserve">Isabelly Ottomayer</w:t>
+      </w:r>
+    </w:p>
+    <w:tbl>
+      <w:tblPr>
+        <w:tblStyle w:val="Table7"/>
+        <w:tblW w:w="14010.0" w:type="dxa"/>
+        <w:jc w:val="left"/>
+        <w:tblBorders>
+          <w:top w:color="000000" w:space="0" w:sz="8" w:val="single"/>
+          <w:left w:color="000000" w:space="0" w:sz="8" w:val="single"/>
+          <w:bottom w:color="000000" w:space="0" w:sz="8" w:val="single"/>
+          <w:right w:color="000000" w:space="0" w:sz="8" w:val="single"/>
+          <w:insideH w:color="000000" w:space="0" w:sz="8" w:val="single"/>
+          <w:insideV w:color="000000" w:space="0" w:sz="8" w:val="single"/>
+        </w:tblBorders>
+        <w:tblLayout w:type="fixed"/>
+        <w:tblLook w:val="0600"/>
+      </w:tblPr>
+      <w:tblGrid>
+        <w:gridCol w:w="2535"/>
+        <w:gridCol w:w="11475"/>
+        <w:tblGridChange w:id="0">
+          <w:tblGrid>
+            <w:gridCol w:w="2535"/>
+            <w:gridCol w:w="11475"/>
+          </w:tblGrid>
+        </w:tblGridChange>
+      </w:tblGrid>
+      <w:tr>
+        <w:trPr>
+          <w:cantSplit w:val="0"/>
+          <w:tblHeader w:val="0"/>
+        </w:trPr>
+        <w:tc>
+          <w:tcPr>
+            <w:shd w:fill="999999" w:val="clear"/>
+            <w:tcMar>
+              <w:top w:w="100.0" w:type="dxa"/>
+              <w:left w:w="100.0" w:type="dxa"/>
+              <w:bottom w:w="100.0" w:type="dxa"/>
+              <w:right w:w="100.0" w:type="dxa"/>
+            </w:tcMar>
+            <w:vAlign w:val="top"/>
+          </w:tcPr>
+          <w:p>
+            <w:pPr>
+              <w:widowControl w:val="0"/>
+              <w:spacing w:line="240" w:lineRule="auto"/>
+              <w:rPr>
+                <w:b w:val="1"/>
+                <w:bCs w:val="1"/>
+                <w:sz w:val="24"/>
+                <w:szCs w:val="24"/>
+              </w:rPr>
+            </w:pPr>
+            <w:r>
+              <w:rPr>
+                <w:b w:val="1"/>
+                <w:bCs w:val="1"/>
+                <w:sz w:val="24"/>
+                <w:szCs w:val="24"/>
+                <w:rtl w:val="0"/>
+              </w:rPr>
+              <w:t xml:space="preserve">CASO DE USO EXPANDIDO - 001</w:t>
+            </w:r>
+          </w:p>
+        </w:tc>
+        <w:tc>
+          <w:tcPr>
+            <w:shd w:fill="999999" w:val="clear"/>
+            <w:tcMar>
+              <w:top w:w="100.0" w:type="dxa"/>
+              <w:left w:w="100.0" w:type="dxa"/>
+              <w:bottom w:w="100.0" w:type="dxa"/>
+              <w:right w:w="100.0" w:type="dxa"/>
+            </w:tcMar>
+            <w:vAlign w:val="top"/>
+          </w:tcPr>
+          <w:p>
+            <w:pPr>
+              <w:spacing w:line="360" w:lineRule="auto"/>
+              <w:jc w:val="both"/>
+              <w:rPr>
+                <w:b w:val="1"/>
+                <w:bCs w:val="1"/>
+                <w:sz w:val="24"/>
+                <w:szCs w:val="24"/>
+              </w:rPr>
+            </w:pPr>
+            <w:r>
+              <w:rPr>
+                <w:b w:val="1"/>
+                <w:bCs w:val="1"/>
+                <w:sz w:val="24"/>
+                <w:szCs w:val="24"/>
+                <w:rtl w:val="0"/>
+              </w:rPr>
+              <w:t xml:space="preserve">Cálculo e Gestão de Frete Regional e Internacional</w:t>
+            </w:r>
+          </w:p>
+        </w:tc>
+      </w:tr>
+      <w:tr>
+        <w:trPr>
+          <w:cantSplit w:val="0"/>
+          <w:tblHeader w:val="0"/>
+        </w:trPr>
+        <w:tc>
+          <w:tcPr>
+            <w:shd w:fill="999999" w:val="clear"/>
+            <w:tcMar>
+              <w:top w:w="100.0" w:type="dxa"/>
+              <w:left w:w="100.0" w:type="dxa"/>
+              <w:bottom w:w="100.0" w:type="dxa"/>
+              <w:right w:w="100.0" w:type="dxa"/>
+            </w:tcMar>
+            <w:vAlign w:val="top"/>
+          </w:tcPr>
+          <w:p>
+            <w:pPr>
+              <w:widowControl w:val="0"/>
+              <w:spacing w:line="240" w:lineRule="auto"/>
+              <w:rPr>
+                <w:b w:val="1"/>
+                <w:bCs w:val="1"/>
+                <w:sz w:val="24"/>
+                <w:szCs w:val="24"/>
+              </w:rPr>
+            </w:pPr>
+            <w:r>
+              <w:rPr>
+                <w:b w:val="1"/>
+                <w:bCs w:val="1"/>
+                <w:sz w:val="24"/>
+                <w:szCs w:val="24"/>
+                <w:rtl w:val="0"/>
+              </w:rPr>
+              <w:t xml:space="preserve">Ator Principal: </w:t>
+            </w:r>
+          </w:p>
+        </w:tc>
+        <w:tc>
+          <w:tcPr>
+            <w:shd w:fill="auto" w:val="clear"/>
+            <w:tcMar>
+              <w:top w:w="100.0" w:type="dxa"/>
+              <w:left w:w="100.0" w:type="dxa"/>
+              <w:bottom w:w="100.0" w:type="dxa"/>
+              <w:right w:w="100.0" w:type="dxa"/>
+            </w:tcMar>
+            <w:vAlign w:val="top"/>
+          </w:tcPr>
+          <w:p>
+            <w:pPr>
+              <w:widowControl w:val="0"/>
+              <w:spacing w:line="240" w:lineRule="auto"/>
+              <w:rPr>
+                <w:sz w:val="24"/>
+                <w:szCs w:val="24"/>
+              </w:rPr>
+            </w:pPr>
+            <w:r>
+              <w:rPr>
+                <w:sz w:val="24"/>
+                <w:szCs w:val="24"/>
+                <w:rtl w:val="0"/>
+              </w:rPr>
+              <w:t xml:space="preserve">Cliente </w:t>
+            </w:r>
+          </w:p>
+        </w:tc>
+      </w:tr>
+      <w:tr>
+        <w:trPr>
+          <w:cantSplit w:val="0"/>
+          <w:tblHeader w:val="0"/>
+        </w:trPr>
+        <w:tc>
+          <w:tcPr>
+            <w:shd w:fill="999999" w:val="clear"/>
+            <w:tcMar>
+              <w:top w:w="100.0" w:type="dxa"/>
+              <w:left w:w="100.0" w:type="dxa"/>
+              <w:bottom w:w="100.0" w:type="dxa"/>
+              <w:right w:w="100.0" w:type="dxa"/>
+            </w:tcMar>
+            <w:vAlign w:val="top"/>
+          </w:tcPr>
+          <w:p>
+            <w:pPr>
+              <w:widowControl w:val="0"/>
+              <w:spacing w:line="240" w:lineRule="auto"/>
+              <w:rPr>
+                <w:b w:val="1"/>
+                <w:bCs w:val="1"/>
+                <w:sz w:val="24"/>
+                <w:szCs w:val="24"/>
+              </w:rPr>
+            </w:pPr>
+            <w:r>
+              <w:rPr>
+                <w:b w:val="1"/>
+                <w:bCs w:val="1"/>
+                <w:sz w:val="24"/>
+                <w:szCs w:val="24"/>
+                <w:rtl w:val="0"/>
+              </w:rPr>
+              <w:t xml:space="preserve">Resumo: </w:t>
+            </w:r>
+          </w:p>
+        </w:tc>
+        <w:tc>
+          <w:tcPr>
+            <w:shd w:fill="auto" w:val="clear"/>
+            <w:tcMar>
+              <w:top w:w="100.0" w:type="dxa"/>
+              <w:left w:w="100.0" w:type="dxa"/>
+              <w:bottom w:w="100.0" w:type="dxa"/>
+              <w:right w:w="100.0" w:type="dxa"/>
+            </w:tcMar>
+            <w:vAlign w:val="top"/>
+          </w:tcPr>
+          <w:p>
+            <w:pPr>
+              <w:widowControl w:val="0"/>
+              <w:spacing w:line="240" w:lineRule="auto"/>
+              <w:jc w:val="both"/>
+              <w:rPr>
+                <w:sz w:val="24"/>
+                <w:szCs w:val="24"/>
+              </w:rPr>
+            </w:pPr>
+            <w:r>
+              <w:rPr>
+                <w:sz w:val="24"/>
+                <w:szCs w:val="24"/>
+                <w:rtl w:val="0"/>
+              </w:rPr>
+              <w:t xml:space="preserve">O sistema deve calcular o custo de entrega aplicando isenção de frete para clientes da região ou cadastrados no programa de fidelidade, e tarifas especiais para entregas internacionais.</w:t>
+            </w:r>
+          </w:p>
+        </w:tc>
+      </w:tr>
+      <w:tr>
+        <w:trPr>
+          <w:cantSplit w:val="0"/>
+          <w:tblHeader w:val="0"/>
+        </w:trPr>
+        <w:tc>
+          <w:tcPr>
+            <w:shd w:fill="999999" w:val="clear"/>
+            <w:tcMar>
+              <w:top w:w="100.0" w:type="dxa"/>
+              <w:left w:w="100.0" w:type="dxa"/>
+              <w:bottom w:w="100.0" w:type="dxa"/>
+              <w:right w:w="100.0" w:type="dxa"/>
+            </w:tcMar>
+            <w:vAlign w:val="top"/>
+          </w:tcPr>
+          <w:p>
+            <w:pPr>
+              <w:widowControl w:val="0"/>
+              <w:spacing w:line="240" w:lineRule="auto"/>
+              <w:rPr>
+                <w:b w:val="1"/>
+                <w:bCs w:val="1"/>
+                <w:sz w:val="24"/>
+                <w:szCs w:val="24"/>
+              </w:rPr>
+            </w:pPr>
+            <w:r>
+              <w:rPr>
+                <w:b w:val="1"/>
+                <w:bCs w:val="1"/>
+                <w:sz w:val="24"/>
+                <w:szCs w:val="24"/>
+                <w:rtl w:val="0"/>
+              </w:rPr>
+              <w:t xml:space="preserve">Pré-condições: </w:t>
+            </w:r>
+          </w:p>
+        </w:tc>
+        <w:tc>
+          <w:tcPr>
+            <w:shd w:fill="auto" w:val="clear"/>
+            <w:tcMar>
+              <w:top w:w="100.0" w:type="dxa"/>
+              <w:left w:w="100.0" w:type="dxa"/>
+              <w:bottom w:w="100.0" w:type="dxa"/>
+              <w:right w:w="100.0" w:type="dxa"/>
+            </w:tcMar>
+            <w:vAlign w:val="top"/>
+          </w:tcPr>
+          <w:p>
+            <w:pPr>
+              <w:widowControl w:val="0"/>
+              <w:spacing w:line="240" w:lineRule="auto"/>
+              <w:rPr>
+                <w:sz w:val="24"/>
+                <w:szCs w:val="24"/>
+              </w:rPr>
+            </w:pPr>
+            <w:r>
+              <w:rPr>
+                <w:sz w:val="24"/>
+                <w:szCs w:val="24"/>
+                <w:rtl w:val="0"/>
+              </w:rPr>
+              <w:t xml:space="preserve">O cliente tem que estar cadastrado e CEP/endereço de entrega informado, para poder adicionar os itens ao carrinho.</w:t>
+            </w:r>
+          </w:p>
+        </w:tc>
+      </w:tr>
+      <w:tr>
+        <w:trPr>
+          <w:cantSplit w:val="0"/>
+          <w:tblHeader w:val="0"/>
+        </w:trPr>
+        <w:tc>
+          <w:tcPr>
+            <w:shd w:fill="999999" w:val="clear"/>
+            <w:tcMar>
+              <w:top w:w="100.0" w:type="dxa"/>
+              <w:left w:w="100.0" w:type="dxa"/>
+              <w:bottom w:w="100.0" w:type="dxa"/>
+              <w:right w:w="100.0" w:type="dxa"/>
+            </w:tcMar>
+            <w:vAlign w:val="top"/>
+          </w:tcPr>
+          <w:p>
+            <w:pPr>
+              <w:widowControl w:val="0"/>
+              <w:spacing w:line="240" w:lineRule="auto"/>
+              <w:rPr>
+                <w:b w:val="1"/>
+                <w:bCs w:val="1"/>
+                <w:sz w:val="24"/>
+                <w:szCs w:val="24"/>
+              </w:rPr>
+            </w:pPr>
+            <w:r>
+              <w:rPr>
+                <w:b w:val="1"/>
+                <w:bCs w:val="1"/>
+                <w:sz w:val="24"/>
+                <w:szCs w:val="24"/>
+                <w:rtl w:val="0"/>
+              </w:rPr>
+              <w:t xml:space="preserve">Pós-condições: </w:t>
+            </w:r>
+          </w:p>
+        </w:tc>
+        <w:tc>
+          <w:tcPr>
+            <w:shd w:fill="auto" w:val="clear"/>
+            <w:tcMar>
+              <w:top w:w="100.0" w:type="dxa"/>
+              <w:left w:w="100.0" w:type="dxa"/>
+              <w:bottom w:w="100.0" w:type="dxa"/>
+              <w:right w:w="100.0" w:type="dxa"/>
+            </w:tcMar>
+            <w:vAlign w:val="top"/>
+          </w:tcPr>
+          <w:p>
+            <w:pPr>
+              <w:widowControl w:val="0"/>
+              <w:spacing w:line="240" w:lineRule="auto"/>
+              <w:rPr>
+                <w:sz w:val="24"/>
+                <w:szCs w:val="24"/>
+              </w:rPr>
+            </w:pPr>
+            <w:r>
+              <w:rPr>
+                <w:sz w:val="24"/>
+                <w:szCs w:val="24"/>
+                <w:rtl w:val="0"/>
+              </w:rPr>
+              <w:t xml:space="preserve">Valor dos itens de vestimentas calculado e com o desconto de frete grátis já adicionado ao total do pedido. </w:t>
+            </w:r>
+          </w:p>
+        </w:tc>
+      </w:tr>
+      <w:tr>
+        <w:trPr>
+          <w:cantSplit w:val="0"/>
+          <w:tblHeader w:val="0"/>
+        </w:trPr>
+        <w:tc>
+          <w:tcPr>
+            <w:shd w:fill="999999" w:val="clear"/>
+            <w:tcMar>
+              <w:top w:w="100.0" w:type="dxa"/>
+              <w:left w:w="100.0" w:type="dxa"/>
+              <w:bottom w:w="100.0" w:type="dxa"/>
+              <w:right w:w="100.0" w:type="dxa"/>
+            </w:tcMar>
+            <w:vAlign w:val="top"/>
+          </w:tcPr>
+          <w:p>
+            <w:pPr>
+              <w:widowControl w:val="0"/>
+              <w:spacing w:line="240" w:lineRule="auto"/>
+              <w:rPr>
+                <w:b w:val="1"/>
+                <w:bCs w:val="1"/>
+                <w:sz w:val="24"/>
+                <w:szCs w:val="24"/>
+              </w:rPr>
+            </w:pPr>
+            <w:r>
+              <w:rPr>
+                <w:b w:val="1"/>
+                <w:bCs w:val="1"/>
+                <w:sz w:val="24"/>
+                <w:szCs w:val="24"/>
+                <w:rtl w:val="0"/>
+              </w:rPr>
+              <w:t xml:space="preserve">Fluxo Principal: </w:t>
+            </w:r>
+          </w:p>
+        </w:tc>
+        <w:tc>
+          <w:tcPr>
+            <w:shd w:fill="auto" w:val="clear"/>
+            <w:tcMar>
+              <w:top w:w="100.0" w:type="dxa"/>
+              <w:left w:w="100.0" w:type="dxa"/>
+              <w:bottom w:w="100.0" w:type="dxa"/>
+              <w:right w:w="100.0" w:type="dxa"/>
+            </w:tcMar>
+            <w:vAlign w:val="top"/>
+          </w:tcPr>
+          <w:p>
+            <w:pPr>
+              <w:widowControl w:val="0"/>
+              <w:spacing w:line="240" w:lineRule="auto"/>
+              <w:rPr>
+                <w:sz w:val="24"/>
+                <w:szCs w:val="24"/>
+              </w:rPr>
+            </w:pPr>
+            <w:r>
+              <w:rPr>
+                <w:sz w:val="24"/>
+                <w:szCs w:val="24"/>
+                <w:rtl w:val="0"/>
+              </w:rPr>
+              <w:t xml:space="preserve">1. O cliente informa o CEP de destino ou seleciona um endereço cadastrado.</w:t>
+            </w:r>
+          </w:p>
+          <w:p>
+            <w:pPr>
+              <w:widowControl w:val="0"/>
+              <w:spacing w:line="240" w:lineRule="auto"/>
+              <w:rPr>
+                <w:sz w:val="24"/>
+                <w:szCs w:val="24"/>
+              </w:rPr>
+            </w:pPr>
+            <w:r>
+              <w:rPr>
+                <w:rtl w:val="0"/>
+              </w:rPr>
+            </w:r>
+          </w:p>
+          <w:p>
+            <w:pPr>
+              <w:widowControl w:val="0"/>
+              <w:spacing w:line="240" w:lineRule="auto"/>
+              <w:rPr>
+                <w:sz w:val="24"/>
+                <w:szCs w:val="24"/>
+              </w:rPr>
+            </w:pPr>
+            <w:r>
+              <w:rPr>
+                <w:sz w:val="24"/>
+                <w:szCs w:val="24"/>
+                <w:rtl w:val="0"/>
+              </w:rPr>
+              <w:t xml:space="preserve">2. O sistema consulta as tabelas de CEP e endereço e localiza a região da casa do cliente/comprador.</w:t>
+            </w:r>
+          </w:p>
+          <w:p>
+            <w:pPr>
+              <w:widowControl w:val="0"/>
+              <w:spacing w:line="240" w:lineRule="auto"/>
+              <w:rPr>
+                <w:sz w:val="24"/>
+                <w:szCs w:val="24"/>
+              </w:rPr>
+            </w:pPr>
+            <w:r>
+              <w:rPr>
+                <w:rtl w:val="0"/>
+              </w:rPr>
+            </w:r>
+          </w:p>
+          <w:p>
+            <w:pPr>
+              <w:widowControl w:val="0"/>
+              <w:spacing w:line="240" w:lineRule="auto"/>
+              <w:rPr>
+                <w:sz w:val="24"/>
+                <w:szCs w:val="24"/>
+              </w:rPr>
+            </w:pPr>
+            <w:r>
+              <w:rPr>
+                <w:sz w:val="24"/>
+                <w:szCs w:val="24"/>
+                <w:rtl w:val="0"/>
+              </w:rPr>
+              <w:t xml:space="preserve">3. O sistema verifica a elegibilidade para gratuidade regional ou do programa de fidelidade.</w:t>
+            </w:r>
+          </w:p>
+          <w:p>
+            <w:pPr>
+              <w:widowControl w:val="0"/>
+              <w:spacing w:line="240" w:lineRule="auto"/>
+              <w:rPr>
+                <w:sz w:val="24"/>
+                <w:szCs w:val="24"/>
+              </w:rPr>
+            </w:pPr>
+            <w:r>
+              <w:rPr>
+                <w:rtl w:val="0"/>
+              </w:rPr>
+            </w:r>
+          </w:p>
+          <w:p>
+            <w:pPr>
+              <w:widowControl w:val="0"/>
+              <w:spacing w:line="240" w:lineRule="auto"/>
+              <w:rPr>
+                <w:sz w:val="24"/>
+                <w:szCs w:val="24"/>
+              </w:rPr>
+            </w:pPr>
+            <w:r>
+              <w:rPr>
+                <w:sz w:val="24"/>
+                <w:szCs w:val="24"/>
+                <w:rtl w:val="0"/>
+              </w:rPr>
+              <w:t xml:space="preserve">4. O sistema calcula o valor final da compra com o valor do frete já adicionado. </w:t>
+            </w:r>
+          </w:p>
+        </w:tc>
+      </w:tr>
+      <w:tr>
+        <w:trPr>
+          <w:cantSplit w:val="0"/>
+          <w:tblHeader w:val="0"/>
+        </w:trPr>
+        <w:tc>
+          <w:tcPr>
+            <w:shd w:fill="999999" w:val="clear"/>
+            <w:tcMar>
+              <w:top w:w="100.0" w:type="dxa"/>
+              <w:left w:w="100.0" w:type="dxa"/>
+              <w:bottom w:w="100.0" w:type="dxa"/>
+              <w:right w:w="100.0" w:type="dxa"/>
+            </w:tcMar>
+            <w:vAlign w:val="top"/>
+          </w:tcPr>
+          <w:p>
+            <w:pPr>
+              <w:widowControl w:val="0"/>
+              <w:spacing w:line="240" w:lineRule="auto"/>
+              <w:rPr>
+                <w:b w:val="1"/>
+                <w:bCs w:val="1"/>
+                <w:sz w:val="24"/>
+                <w:szCs w:val="24"/>
+              </w:rPr>
+            </w:pPr>
+            <w:r>
+              <w:rPr>
+                <w:b w:val="1"/>
+                <w:bCs w:val="1"/>
+                <w:sz w:val="24"/>
+                <w:szCs w:val="24"/>
+                <w:rtl w:val="0"/>
+              </w:rPr>
+              <w:t xml:space="preserve">Fluxos Alternativos: </w:t>
+            </w:r>
+          </w:p>
+        </w:tc>
+        <w:tc>
+          <w:tcPr>
+            <w:shd w:fill="auto" w:val="clear"/>
+            <w:tcMar>
+              <w:top w:w="100.0" w:type="dxa"/>
+              <w:left w:w="100.0" w:type="dxa"/>
+              <w:bottom w:w="100.0" w:type="dxa"/>
+              <w:right w:w="100.0" w:type="dxa"/>
+            </w:tcMar>
+            <w:vAlign w:val="top"/>
+          </w:tcPr>
+          <w:p>
+            <w:pPr>
+              <w:widowControl w:val="0"/>
+              <w:spacing w:line="240" w:lineRule="auto"/>
+              <w:rPr>
+                <w:b w:val="1"/>
+                <w:bCs w:val="1"/>
+                <w:sz w:val="24"/>
+                <w:szCs w:val="24"/>
+              </w:rPr>
+            </w:pPr>
+            <w:r>
+              <w:rPr>
+                <w:b w:val="1"/>
+                <w:bCs w:val="1"/>
+                <w:sz w:val="24"/>
+                <w:szCs w:val="24"/>
+                <w:rtl w:val="0"/>
+              </w:rPr>
+              <w:t xml:space="preserve">FA01 - Aplicação de Frete Grátis:</w:t>
+            </w:r>
+          </w:p>
+          <w:p>
+            <w:pPr>
+              <w:widowControl w:val="0"/>
+              <w:spacing w:line="240" w:lineRule="auto"/>
               <w:rPr>
                 <w:sz w:val="24"/>
                 <w:szCs w:val="24"/>
@@ -8944,21 +9809,387 @@
               <w:spacing w:line="240" w:lineRule="auto"/>
               <w:ind w:left="720" w:hanging="360"/>
               <w:rPr>
-                <w:b w:val="1"/>
-                <w:bCs w:val="1"/>
-                <w:sz w:val="24"/>
-                <w:szCs w:val="24"/>
-              </w:rPr>
-            </w:pPr>
-            <w:r>
-              <w:rPr>
-                <w:b w:val="1"/>
-                <w:bCs w:val="1"/>
-                <w:sz w:val="24"/>
-                <w:szCs w:val="24"/>
-                <w:rtl w:val="0"/>
-              </w:rPr>
-              <w:t xml:space="preserve">RF02 </w:t>
+                <w:sz w:val="24"/>
+                <w:szCs w:val="24"/>
+              </w:rPr>
+            </w:pPr>
+            <w:r>
+              <w:rPr>
+                <w:b w:val="1"/>
+                <w:bCs w:val="1"/>
+                <w:sz w:val="24"/>
+                <w:szCs w:val="24"/>
+                <w:rtl w:val="0"/>
+              </w:rPr>
+              <w:t xml:space="preserve">3a.</w:t>
+            </w:r>
+            <w:r>
+              <w:rPr>
+                <w:sz w:val="24"/>
+                <w:szCs w:val="24"/>
+                <w:rtl w:val="0"/>
+              </w:rPr>
+              <w:t xml:space="preserve"> O sistema identifica que o CEP pertence à mesma região metropolitana do CD ou que o cliente é membro ativo da loja ou fiel à loja. </w:t>
+            </w:r>
+          </w:p>
+          <w:p>
+            <w:pPr>
+              <w:widowControl w:val="0"/>
+              <w:spacing w:line="240" w:lineRule="auto"/>
+              <w:ind w:left="720" w:firstLine="0"/>
+              <w:rPr>
+                <w:sz w:val="24"/>
+                <w:szCs w:val="24"/>
+              </w:rPr>
+            </w:pPr>
+            <w:r>
+              <w:rPr>
+                <w:rtl w:val="0"/>
+              </w:rPr>
+            </w:r>
+          </w:p>
+          <w:p>
+            <w:pPr>
+              <w:widowControl w:val="0"/>
+              <w:numPr>
+                <w:ilvl w:val="0"/>
+                <w:numId w:val="2"/>
+              </w:numPr>
+              <w:spacing w:line="240" w:lineRule="auto"/>
+              <w:ind w:left="720" w:hanging="360"/>
+              <w:rPr>
+                <w:sz w:val="24"/>
+                <w:szCs w:val="24"/>
+              </w:rPr>
+            </w:pPr>
+            <w:r>
+              <w:rPr>
+                <w:b w:val="1"/>
+                <w:bCs w:val="1"/>
+                <w:sz w:val="24"/>
+                <w:szCs w:val="24"/>
+                <w:rtl w:val="0"/>
+              </w:rPr>
+              <w:t xml:space="preserve">3b.</w:t>
+            </w:r>
+            <w:r>
+              <w:rPr>
+                <w:sz w:val="24"/>
+                <w:szCs w:val="24"/>
+                <w:rtl w:val="0"/>
+              </w:rPr>
+              <w:t xml:space="preserve"> O sistema aplica isenção total de frete grátis (R$ 0,00) ao carrinho, caso usado cupom  </w:t>
+            </w:r>
+          </w:p>
+          <w:p>
+            <w:pPr>
+              <w:widowControl w:val="0"/>
+              <w:spacing w:line="240" w:lineRule="auto"/>
+              <w:rPr>
+                <w:sz w:val="24"/>
+                <w:szCs w:val="24"/>
+              </w:rPr>
+            </w:pPr>
+            <w:r>
+              <w:rPr>
+                <w:rtl w:val="0"/>
+              </w:rPr>
+            </w:r>
+          </w:p>
+        </w:tc>
+      </w:tr>
+      <w:tr>
+        <w:trPr>
+          <w:cantSplit w:val="0"/>
+          <w:tblHeader w:val="0"/>
+        </w:trPr>
+        <w:tc>
+          <w:tcPr>
+            <w:shd w:fill="999999" w:val="clear"/>
+            <w:tcMar>
+              <w:top w:w="100.0" w:type="dxa"/>
+              <w:left w:w="100.0" w:type="dxa"/>
+              <w:bottom w:w="100.0" w:type="dxa"/>
+              <w:right w:w="100.0" w:type="dxa"/>
+            </w:tcMar>
+            <w:vAlign w:val="top"/>
+          </w:tcPr>
+          <w:p>
+            <w:pPr>
+              <w:widowControl w:val="0"/>
+              <w:spacing w:line="240" w:lineRule="auto"/>
+              <w:rPr>
+                <w:b w:val="1"/>
+                <w:bCs w:val="1"/>
+                <w:sz w:val="24"/>
+                <w:szCs w:val="24"/>
+              </w:rPr>
+            </w:pPr>
+            <w:r>
+              <w:rPr>
+                <w:b w:val="1"/>
+                <w:bCs w:val="1"/>
+                <w:sz w:val="24"/>
+                <w:szCs w:val="24"/>
+                <w:rtl w:val="0"/>
+              </w:rPr>
+              <w:t xml:space="preserve">Fluxos de Exceção: </w:t>
+            </w:r>
+          </w:p>
+        </w:tc>
+        <w:tc>
+          <w:tcPr>
+            <w:shd w:fill="auto" w:val="clear"/>
+            <w:tcMar>
+              <w:top w:w="100.0" w:type="dxa"/>
+              <w:left w:w="100.0" w:type="dxa"/>
+              <w:bottom w:w="100.0" w:type="dxa"/>
+              <w:right w:w="100.0" w:type="dxa"/>
+            </w:tcMar>
+            <w:vAlign w:val="top"/>
+          </w:tcPr>
+          <w:p>
+            <w:pPr>
+              <w:widowControl w:val="0"/>
+              <w:spacing w:line="240" w:lineRule="auto"/>
+              <w:rPr>
+                <w:b w:val="1"/>
+                <w:bCs w:val="1"/>
+                <w:sz w:val="24"/>
+                <w:szCs w:val="24"/>
+              </w:rPr>
+            </w:pPr>
+            <w:r>
+              <w:rPr>
+                <w:b w:val="1"/>
+                <w:bCs w:val="1"/>
+                <w:sz w:val="24"/>
+                <w:szCs w:val="24"/>
+                <w:rtl w:val="0"/>
+              </w:rPr>
+              <w:t xml:space="preserve">FE01 - Indisponibilidade na Entrega:</w:t>
+            </w:r>
+          </w:p>
+          <w:p>
+            <w:pPr>
+              <w:widowControl w:val="0"/>
+              <w:spacing w:line="240" w:lineRule="auto"/>
+              <w:rPr>
+                <w:sz w:val="24"/>
+                <w:szCs w:val="24"/>
+              </w:rPr>
+            </w:pPr>
+            <w:r>
+              <w:rPr>
+                <w:rtl w:val="0"/>
+              </w:rPr>
+            </w:r>
+          </w:p>
+          <w:p>
+            <w:pPr>
+              <w:widowControl w:val="0"/>
+              <w:numPr>
+                <w:ilvl w:val="0"/>
+                <w:numId w:val="3"/>
+              </w:numPr>
+              <w:spacing w:line="240" w:lineRule="auto"/>
+              <w:ind w:left="720" w:hanging="360"/>
+              <w:rPr>
+                <w:sz w:val="24"/>
+                <w:szCs w:val="24"/>
+              </w:rPr>
+            </w:pPr>
+            <w:r>
+              <w:rPr>
+                <w:b w:val="1"/>
+                <w:bCs w:val="1"/>
+                <w:sz w:val="24"/>
+                <w:szCs w:val="24"/>
+                <w:rtl w:val="0"/>
+              </w:rPr>
+              <w:t xml:space="preserve">2a.</w:t>
+            </w:r>
+            <w:r>
+              <w:rPr>
+                <w:sz w:val="24"/>
+                <w:szCs w:val="24"/>
+                <w:rtl w:val="0"/>
+              </w:rPr>
+              <w:t xml:space="preserve"> O entregador transportadora não responde no tempo limite. </w:t>
+            </w:r>
+          </w:p>
+          <w:p>
+            <w:pPr>
+              <w:widowControl w:val="0"/>
+              <w:spacing w:line="240" w:lineRule="auto"/>
+              <w:ind w:left="720" w:firstLine="0"/>
+              <w:rPr>
+                <w:sz w:val="24"/>
+                <w:szCs w:val="24"/>
+              </w:rPr>
+            </w:pPr>
+            <w:r>
+              <w:rPr>
+                <w:rtl w:val="0"/>
+              </w:rPr>
+            </w:r>
+          </w:p>
+          <w:p>
+            <w:pPr>
+              <w:widowControl w:val="0"/>
+              <w:numPr>
+                <w:ilvl w:val="0"/>
+                <w:numId w:val="3"/>
+              </w:numPr>
+              <w:spacing w:line="240" w:lineRule="auto"/>
+              <w:ind w:left="720" w:hanging="360"/>
+              <w:rPr>
+                <w:sz w:val="24"/>
+                <w:szCs w:val="24"/>
+              </w:rPr>
+            </w:pPr>
+            <w:r>
+              <w:rPr>
+                <w:b w:val="1"/>
+                <w:bCs w:val="1"/>
+                <w:sz w:val="24"/>
+                <w:szCs w:val="24"/>
+                <w:rtl w:val="0"/>
+              </w:rPr>
+              <w:t xml:space="preserve">2b.</w:t>
+            </w:r>
+            <w:r>
+              <w:rPr>
+                <w:sz w:val="24"/>
+                <w:szCs w:val="24"/>
+                <w:rtl w:val="0"/>
+              </w:rPr>
+              <w:t xml:space="preserve"> O sistema utiliza a tabela de contingência offline de frete estimado e exibe aviso ao usuário. (Pode ter alteração no valor - Deve ser consultado posteriormente).</w:t>
+            </w:r>
+          </w:p>
+        </w:tc>
+      </w:tr>
+      <w:tr>
+        <w:trPr>
+          <w:cantSplit w:val="0"/>
+          <w:tblHeader w:val="0"/>
+        </w:trPr>
+        <w:tc>
+          <w:tcPr>
+            <w:shd w:fill="999999" w:val="clear"/>
+            <w:tcMar>
+              <w:top w:w="100.0" w:type="dxa"/>
+              <w:left w:w="100.0" w:type="dxa"/>
+              <w:bottom w:w="100.0" w:type="dxa"/>
+              <w:right w:w="100.0" w:type="dxa"/>
+            </w:tcMar>
+            <w:vAlign w:val="top"/>
+          </w:tcPr>
+          <w:p>
+            <w:pPr>
+              <w:widowControl w:val="0"/>
+              <w:spacing w:line="240" w:lineRule="auto"/>
+              <w:rPr>
+                <w:b w:val="1"/>
+                <w:bCs w:val="1"/>
+                <w:sz w:val="24"/>
+                <w:szCs w:val="24"/>
+              </w:rPr>
+            </w:pPr>
+            <w:r>
+              <w:rPr>
+                <w:b w:val="1"/>
+                <w:bCs w:val="1"/>
+                <w:sz w:val="24"/>
+                <w:szCs w:val="24"/>
+                <w:rtl w:val="0"/>
+              </w:rPr>
+              <w:t xml:space="preserve">Relações de Regras de Negócio: </w:t>
+            </w:r>
+          </w:p>
+        </w:tc>
+        <w:tc>
+          <w:tcPr>
+            <w:shd w:fill="auto" w:val="clear"/>
+            <w:tcMar>
+              <w:top w:w="100.0" w:type="dxa"/>
+              <w:left w:w="100.0" w:type="dxa"/>
+              <w:bottom w:w="100.0" w:type="dxa"/>
+              <w:right w:w="100.0" w:type="dxa"/>
+            </w:tcMar>
+            <w:vAlign w:val="top"/>
+          </w:tcPr>
+          <w:p>
+            <w:pPr>
+              <w:widowControl w:val="0"/>
+              <w:numPr>
+                <w:ilvl w:val="0"/>
+                <w:numId w:val="8"/>
+              </w:numPr>
+              <w:spacing w:line="240" w:lineRule="auto"/>
+              <w:ind w:left="720" w:hanging="360"/>
+              <w:rPr>
+                <w:sz w:val="24"/>
+                <w:szCs w:val="24"/>
+              </w:rPr>
+            </w:pPr>
+            <w:r>
+              <w:rPr>
+                <w:b w:val="1"/>
+                <w:bCs w:val="1"/>
+                <w:sz w:val="24"/>
+                <w:szCs w:val="24"/>
+                <w:rtl w:val="0"/>
+              </w:rPr>
+              <w:t xml:space="preserve">RN03</w:t>
+            </w:r>
+            <w:r>
+              <w:rPr>
+                <w:rtl w:val="0"/>
+              </w:rPr>
+            </w:r>
+          </w:p>
+          <w:p>
+            <w:pPr>
+              <w:widowControl w:val="0"/>
+              <w:spacing w:line="240" w:lineRule="auto"/>
+              <w:ind w:left="720" w:firstLine="0"/>
+              <w:rPr>
+                <w:sz w:val="24"/>
+                <w:szCs w:val="24"/>
+              </w:rPr>
+            </w:pPr>
+            <w:r>
+              <w:rPr>
+                <w:rtl w:val="0"/>
+              </w:rPr>
+            </w:r>
+          </w:p>
+          <w:p>
+            <w:pPr>
+              <w:widowControl w:val="0"/>
+              <w:numPr>
+                <w:ilvl w:val="0"/>
+                <w:numId w:val="8"/>
+              </w:numPr>
+              <w:spacing w:line="240" w:lineRule="auto"/>
+              <w:ind w:left="720" w:hanging="360"/>
+              <w:rPr>
+                <w:b w:val="1"/>
+                <w:bCs w:val="1"/>
+                <w:sz w:val="24"/>
+                <w:szCs w:val="24"/>
+              </w:rPr>
+            </w:pPr>
+            <w:r>
+              <w:rPr>
+                <w:b w:val="1"/>
+                <w:bCs w:val="1"/>
+                <w:sz w:val="24"/>
+                <w:szCs w:val="24"/>
+                <w:rtl w:val="0"/>
+              </w:rPr>
+              <w:t xml:space="preserve">RF02</w:t>
             </w:r>
           </w:p>
         </w:tc>
@@ -9130,6 +10361,31 @@
         <w:rPr>
           <w:rtl w:val="0"/>
         </w:rPr>
+      </w:r>
+    </w:p>
+    <w:p>
+      <w:pPr>
+        <w:spacing w:line="360" w:lineRule="auto"/>
+        <w:jc w:val="both"/>
+        <w:rPr/>
+      </w:pPr>
+      <w:r>
+        <w:rPr>
+          <w:rtl w:val="0"/>
+        </w:rPr>
+      </w:r>
+    </w:p>
+    <w:p>
+      <w:pPr>
+        <w:spacing w:line="360" w:lineRule="auto"/>
+        <w:jc w:val="both"/>
+        <w:rPr/>
+      </w:pPr>
+      <w:r>
+        <w:rPr>
+          <w:rtl w:val="0"/>
+        </w:rPr>
+        <w:t xml:space="preserve">                     </w:t>
       </w:r>
     </w:p>
     <w:p>
@@ -9828,6 +11084,336 @@
     </w:lvl>
   </w:abstractNum>
   <w:abstractNum w:abstractNumId="7">
+    <w:lvl w:ilvl="0">
+      <w:start w:val="1"/>
+      <w:numFmt w:val="bullet"/>
+      <w:lvlText w:val="●"/>
+      <w:lvlJc w:val="left"/>
+      <w:pPr>
+        <w:ind w:left="720" w:hanging="360"/>
+      </w:pPr>
+      <w:rPr>
+        <w:u w:val="none"/>
+      </w:rPr>
+    </w:lvl>
+    <w:lvl w:ilvl="1">
+      <w:start w:val="1"/>
+      <w:numFmt w:val="bullet"/>
+      <w:lvlText w:val="○"/>
+      <w:lvlJc w:val="left"/>
+      <w:pPr>
+        <w:ind w:left="1440" w:hanging="360"/>
+      </w:pPr>
+      <w:rPr>
+        <w:u w:val="none"/>
+      </w:rPr>
+    </w:lvl>
+    <w:lvl w:ilvl="2">
+      <w:start w:val="1"/>
+      <w:numFmt w:val="bullet"/>
+      <w:lvlText w:val="■"/>
+      <w:lvlJc w:val="left"/>
+      <w:pPr>
+        <w:ind w:left="2160" w:hanging="360"/>
+      </w:pPr>
+      <w:rPr>
+        <w:u w:val="none"/>
+      </w:rPr>
+    </w:lvl>
+    <w:lvl w:ilvl="3">
+      <w:start w:val="1"/>
+      <w:numFmt w:val="bullet"/>
+      <w:lvlText w:val="●"/>
+      <w:lvlJc w:val="left"/>
+      <w:pPr>
+        <w:ind w:left="2880" w:hanging="360"/>
+      </w:pPr>
+      <w:rPr>
+        <w:u w:val="none"/>
+      </w:rPr>
+    </w:lvl>
+    <w:lvl w:ilvl="4">
+      <w:start w:val="1"/>
+      <w:numFmt w:val="bullet"/>
+      <w:lvlText w:val="○"/>
+      <w:lvlJc w:val="left"/>
+      <w:pPr>
+        <w:ind w:left="3600" w:hanging="360"/>
+      </w:pPr>
+      <w:rPr>
+        <w:u w:val="none"/>
+      </w:rPr>
+    </w:lvl>
+    <w:lvl w:ilvl="5">
+      <w:start w:val="1"/>
+      <w:numFmt w:val="bullet"/>
+      <w:lvlText w:val="■"/>
+      <w:lvlJc w:val="left"/>
+      <w:pPr>
+        <w:ind w:left="4320" w:hanging="360"/>
+      </w:pPr>
+      <w:rPr>
+        <w:u w:val="none"/>
+      </w:rPr>
+    </w:lvl>
+    <w:lvl w:ilvl="6">
+      <w:start w:val="1"/>
+      <w:numFmt w:val="bullet"/>
+      <w:lvlText w:val="●"/>
+      <w:lvlJc w:val="left"/>
+      <w:pPr>
+        <w:ind w:left="5040" w:hanging="360"/>
+      </w:pPr>
+      <w:rPr>
+        <w:u w:val="none"/>
+      </w:rPr>
+    </w:lvl>
+    <w:lvl w:ilvl="7">
+      <w:start w:val="1"/>
+      <w:numFmt w:val="bullet"/>
+      <w:lvlText w:val="○"/>
+      <w:lvlJc w:val="left"/>
+      <w:pPr>
+        <w:ind w:left="5760" w:hanging="360"/>
+      </w:pPr>
+      <w:rPr>
+        <w:u w:val="none"/>
+      </w:rPr>
+    </w:lvl>
+    <w:lvl w:ilvl="8">
+      <w:start w:val="1"/>
+      <w:numFmt w:val="bullet"/>
+      <w:lvlText w:val="■"/>
+      <w:lvlJc w:val="left"/>
+      <w:pPr>
+        <w:ind w:left="6480" w:hanging="360"/>
+      </w:pPr>
+      <w:rPr>
+        <w:u w:val="none"/>
+      </w:rPr>
+    </w:lvl>
+  </w:abstractNum>
+  <w:abstractNum w:abstractNumId="8">
+    <w:lvl w:ilvl="0">
+      <w:start w:val="1"/>
+      <w:numFmt w:val="bullet"/>
+      <w:lvlText w:val="●"/>
+      <w:lvlJc w:val="left"/>
+      <w:pPr>
+        <w:ind w:left="720" w:hanging="360"/>
+      </w:pPr>
+      <w:rPr>
+        <w:u w:val="none"/>
+      </w:rPr>
+    </w:lvl>
+    <w:lvl w:ilvl="1">
+      <w:start w:val="1"/>
+      <w:numFmt w:val="bullet"/>
+      <w:lvlText w:val="○"/>
+      <w:lvlJc w:val="left"/>
+      <w:pPr>
+        <w:ind w:left="1440" w:hanging="360"/>
+      </w:pPr>
+      <w:rPr>
+        <w:u w:val="none"/>
+      </w:rPr>
+    </w:lvl>
+    <w:lvl w:ilvl="2">
+      <w:start w:val="1"/>
+      <w:numFmt w:val="bullet"/>
+      <w:lvlText w:val="■"/>
+      <w:lvlJc w:val="left"/>
+      <w:pPr>
+        <w:ind w:left="2160" w:hanging="360"/>
+      </w:pPr>
+      <w:rPr>
+        <w:u w:val="none"/>
+      </w:rPr>
+    </w:lvl>
+    <w:lvl w:ilvl="3">
+      <w:start w:val="1"/>
+      <w:numFmt w:val="bullet"/>
+      <w:lvlText w:val="●"/>
+      <w:lvlJc w:val="left"/>
+      <w:pPr>
+        <w:ind w:left="2880" w:hanging="360"/>
+      </w:pPr>
+      <w:rPr>
+        <w:u w:val="none"/>
+      </w:rPr>
+    </w:lvl>
+    <w:lvl w:ilvl="4">
+      <w:start w:val="1"/>
+      <w:numFmt w:val="bullet"/>
+      <w:lvlText w:val="○"/>
+      <w:lvlJc w:val="left"/>
+      <w:pPr>
+        <w:ind w:left="3600" w:hanging="360"/>
+      </w:pPr>
+      <w:rPr>
+        <w:u w:val="none"/>
+      </w:rPr>
+    </w:lvl>
+    <w:lvl w:ilvl="5">
+      <w:start w:val="1"/>
+      <w:numFmt w:val="bullet"/>
+      <w:lvlText w:val="■"/>
+      <w:lvlJc w:val="left"/>
+      <w:pPr>
+        <w:ind w:left="4320" w:hanging="360"/>
+      </w:pPr>
+      <w:rPr>
+        <w:u w:val="none"/>
+      </w:rPr>
+    </w:lvl>
+    <w:lvl w:ilvl="6">
+      <w:start w:val="1"/>
+      <w:numFmt w:val="bullet"/>
+      <w:lvlText w:val="●"/>
+      <w:lvlJc w:val="left"/>
+      <w:pPr>
+        <w:ind w:left="5040" w:hanging="360"/>
+      </w:pPr>
+      <w:rPr>
+        <w:u w:val="none"/>
+      </w:rPr>
+    </w:lvl>
+    <w:lvl w:ilvl="7">
+      <w:start w:val="1"/>
+      <w:numFmt w:val="bullet"/>
+      <w:lvlText w:val="○"/>
+      <w:lvlJc w:val="left"/>
+      <w:pPr>
+        <w:ind w:left="5760" w:hanging="360"/>
+      </w:pPr>
+      <w:rPr>
+        <w:u w:val="none"/>
+      </w:rPr>
+    </w:lvl>
+    <w:lvl w:ilvl="8">
+      <w:start w:val="1"/>
+      <w:numFmt w:val="bullet"/>
+      <w:lvlText w:val="■"/>
+      <w:lvlJc w:val="left"/>
+      <w:pPr>
+        <w:ind w:left="6480" w:hanging="360"/>
+      </w:pPr>
+      <w:rPr>
+        <w:u w:val="none"/>
+      </w:rPr>
+    </w:lvl>
+  </w:abstractNum>
+  <w:abstractNum w:abstractNumId="9">
+    <w:lvl w:ilvl="0">
+      <w:start w:val="1"/>
+      <w:numFmt w:val="bullet"/>
+      <w:lvlText w:val="●"/>
+      <w:lvlJc w:val="left"/>
+      <w:pPr>
+        <w:ind w:left="720" w:hanging="360"/>
+      </w:pPr>
+      <w:rPr>
+        <w:u w:val="none"/>
+      </w:rPr>
+    </w:lvl>
+    <w:lvl w:ilvl="1">
+      <w:start w:val="1"/>
+      <w:numFmt w:val="bullet"/>
+      <w:lvlText w:val="○"/>
+      <w:lvlJc w:val="left"/>
+      <w:pPr>
+        <w:ind w:left="1440" w:hanging="360"/>
+      </w:pPr>
+      <w:rPr>
+        <w:u w:val="none"/>
+      </w:rPr>
+    </w:lvl>
+    <w:lvl w:ilvl="2">
+      <w:start w:val="1"/>
+      <w:numFmt w:val="bullet"/>
+      <w:lvlText w:val="■"/>
+      <w:lvlJc w:val="left"/>
+      <w:pPr>
+        <w:ind w:left="2160" w:hanging="360"/>
+      </w:pPr>
+      <w:rPr>
+        <w:u w:val="none"/>
+      </w:rPr>
+    </w:lvl>
+    <w:lvl w:ilvl="3">
+      <w:start w:val="1"/>
+      <w:numFmt w:val="bullet"/>
+      <w:lvlText w:val="●"/>
+      <w:lvlJc w:val="left"/>
+      <w:pPr>
+        <w:ind w:left="2880" w:hanging="360"/>
+      </w:pPr>
+      <w:rPr>
+        <w:u w:val="none"/>
+      </w:rPr>
+    </w:lvl>
+    <w:lvl w:ilvl="4">
+      <w:start w:val="1"/>
+      <w:numFmt w:val="bullet"/>
+      <w:lvlText w:val="○"/>
+      <w:lvlJc w:val="left"/>
+      <w:pPr>
+        <w:ind w:left="3600" w:hanging="360"/>
+      </w:pPr>
+      <w:rPr>
+        <w:u w:val="none"/>
+      </w:rPr>
+    </w:lvl>
+    <w:lvl w:ilvl="5">
+      <w:start w:val="1"/>
+      <w:numFmt w:val="bullet"/>
+      <w:lvlText w:val="■"/>
+      <w:lvlJc w:val="left"/>
+      <w:pPr>
+        <w:ind w:left="4320" w:hanging="360"/>
+      </w:pPr>
+      <w:rPr>
+        <w:u w:val="none"/>
+      </w:rPr>
+    </w:lvl>
+    <w:lvl w:ilvl="6">
+      <w:start w:val="1"/>
+      <w:numFmt w:val="bullet"/>
+      <w:lvlText w:val="●"/>
+      <w:lvlJc w:val="left"/>
+      <w:pPr>
+        <w:ind w:left="5040" w:hanging="360"/>
+      </w:pPr>
+      <w:rPr>
+        <w:u w:val="none"/>
+      </w:rPr>
+    </w:lvl>
+    <w:lvl w:ilvl="7">
+      <w:start w:val="1"/>
+      <w:numFmt w:val="bullet"/>
+      <w:lvlText w:val="○"/>
+      <w:lvlJc w:val="left"/>
+      <w:pPr>
+        <w:ind w:left="5760" w:hanging="360"/>
+      </w:pPr>
+      <w:rPr>
+        <w:u w:val="none"/>
+      </w:rPr>
+    </w:lvl>
+    <w:lvl w:ilvl="8">
+      <w:start w:val="1"/>
+      <w:numFmt w:val="bullet"/>
+      <w:lvlText w:val="■"/>
+      <w:lvlJc w:val="left"/>
+      <w:pPr>
+        <w:ind w:left="6480" w:hanging="360"/>
+      </w:pPr>
+      <w:rPr>
+        <w:u w:val="none"/>
+      </w:rPr>
+    </w:lvl>
+  </w:abstractNum>
+  <w:abstractNum w:abstractNumId="10">
     <w:lvl w:ilvl="0">
       <w:start w:val="1"/>
       <w:numFmt w:val="bullet"/>
@@ -9957,6 +11543,15 @@
   </w:num>
   <w:num w:numId="7">
     <w:abstractNumId w:val="7"/>
+  </w:num>
+  <w:num w:numId="8">
+    <w:abstractNumId w:val="8"/>
+  </w:num>
+  <w:num w:numId="9">
+    <w:abstractNumId w:val="9"/>
+  </w:num>
+  <w:num w:numId="10">
+    <w:abstractNumId w:val="10"/>
   </w:num>
 </w:numbering>
 </file>
@@ -10162,6 +11757,13 @@
     </w:tblPr>
   </w:style>
   <w:style w:type="table" w:styleId="Table6">
+    <w:basedOn w:val="TableNormal"/>
+    <w:tblPr>
+      <w:tblStyleRowBandSize w:val="1"/>
+      <w:tblStyleColBandSize w:val="1"/>
+    </w:tblPr>
+  </w:style>
+  <w:style w:type="table" w:styleId="Table7">
     <w:basedOn w:val="TableNormal"/>
     <w:tblPr>
       <w:tblStyleRowBandSize w:val="1"/>

</xml_diff>

<commit_message>
tabela cadastro cliente,calculo de frete, gestao de banimento
</commit_message>
<xml_diff>
--- a/projeto_analise_vest-shop.docx
+++ b/projeto_analise_vest-shop.docx
@@ -26,7 +26,7 @@
           <w:szCs w:val="24"/>
           <w:rtl w:val="0"/>
         </w:rPr>
-        <w:t xml:space="preserve">a atividade: Trimestre 3 - Atividade AV_1</w:t>
+        <w:t xml:space="preserve">3</w:t>
       </w:r>
     </w:p>
     <w:p>
@@ -43,17 +43,12 @@
           <w:szCs w:val="24"/>
         </w:rPr>
       </w:pPr>
-      <w:bookmarkStart w:colFirst="0" w:colLast="0" w:name="_xdmc9119ohw5" w:id="1"/>
+      <w:bookmarkStart w:colFirst="0" w:colLast="0" w:name="_83u0t8qx97ij" w:id="1"/>
       <w:bookmarkEnd w:id="1"/>
       <w:r>
         <w:rPr>
-          <w:b w:val="1"/>
-          <w:bCs w:val="1"/>
-          <w:sz w:val="24"/>
-          <w:szCs w:val="24"/>
-          <w:rtl w:val="0"/>
-        </w:rPr>
-        <w:t xml:space="preserve">Criado em: 7 de out.7 de out. (editado: 7 de out.)a atividade: Trimestre 3 - Atividade AV_1</w:t>
+          <w:rtl w:val="0"/>
+        </w:rPr>
       </w:r>
     </w:p>
     <w:p>
@@ -70,8 +65,62 @@
           <w:szCs w:val="24"/>
         </w:rPr>
       </w:pPr>
-      <w:bookmarkStart w:colFirst="0" w:colLast="0" w:name="_y0ioyi55r29f" w:id="2"/>
+      <w:bookmarkStart w:colFirst="0" w:colLast="0" w:name="_u15gaocqsbil" w:id="2"/>
       <w:bookmarkEnd w:id="2"/>
+      <w:r>
+        <w:rPr>
+          <w:b w:val="1"/>
+          <w:bCs w:val="1"/>
+          <w:sz w:val="24"/>
+          <w:szCs w:val="24"/>
+          <w:rtl w:val="0"/>
+        </w:rPr>
+        <w:t xml:space="preserve">a atividade: Trimestre 3 - Atividade AV_1</w:t>
+      </w:r>
+    </w:p>
+    <w:p>
+      <w:pPr>
+        <w:pStyle w:val="Heading1"/>
+        <w:keepNext w:val="0"/>
+        <w:keepLines w:val="0"/>
+        <w:spacing w:before="480" w:line="360" w:lineRule="auto"/>
+        <w:jc w:val="both"/>
+        <w:rPr>
+          <w:b w:val="1"/>
+          <w:bCs w:val="1"/>
+          <w:sz w:val="24"/>
+          <w:szCs w:val="24"/>
+        </w:rPr>
+      </w:pPr>
+      <w:bookmarkStart w:colFirst="0" w:colLast="0" w:name="_xdmc9119ohw5" w:id="3"/>
+      <w:bookmarkEnd w:id="3"/>
+      <w:r>
+        <w:rPr>
+          <w:b w:val="1"/>
+          <w:bCs w:val="1"/>
+          <w:sz w:val="24"/>
+          <w:szCs w:val="24"/>
+          <w:rtl w:val="0"/>
+        </w:rPr>
+        <w:t xml:space="preserve">Criado em: 7 de out.7 de out. (editado: 7 de out.)a atividade: Trimestre 3 - Atividade AV_1</w:t>
+      </w:r>
+    </w:p>
+    <w:p>
+      <w:pPr>
+        <w:pStyle w:val="Heading1"/>
+        <w:keepNext w:val="0"/>
+        <w:keepLines w:val="0"/>
+        <w:spacing w:before="480" w:line="360" w:lineRule="auto"/>
+        <w:jc w:val="both"/>
+        <w:rPr>
+          <w:b w:val="1"/>
+          <w:bCs w:val="1"/>
+          <w:sz w:val="24"/>
+          <w:szCs w:val="24"/>
+        </w:rPr>
+      </w:pPr>
+      <w:bookmarkStart w:colFirst="0" w:colLast="0" w:name="_y0ioyi55r29f" w:id="4"/>
+      <w:bookmarkEnd w:id="4"/>
       <w:r>
         <w:rPr>
           <w:b w:val="1"/>
@@ -97,8 +146,8 @@
           <w:szCs w:val="24"/>
         </w:rPr>
       </w:pPr>
-      <w:bookmarkStart w:colFirst="0" w:colLast="0" w:name="_pck0boc0y308" w:id="3"/>
-      <w:bookmarkEnd w:id="3"/>
+      <w:bookmarkStart w:colFirst="0" w:colLast="0" w:name="_pck0boc0y308" w:id="5"/>
+      <w:bookmarkEnd w:id="5"/>
       <w:r>
         <w:rPr>
           <w:b w:val="1"/>
@@ -420,8 +469,8 @@
           <w:szCs w:val="24"/>
         </w:rPr>
       </w:pPr>
-      <w:bookmarkStart w:colFirst="0" w:colLast="0" w:name="_m198mjjljcqk" w:id="4"/>
-      <w:bookmarkEnd w:id="4"/>
+      <w:bookmarkStart w:colFirst="0" w:colLast="0" w:name="_m198mjjljcqk" w:id="6"/>
+      <w:bookmarkEnd w:id="6"/>
       <w:r>
         <w:rPr>
           <w:b w:val="1"/>
@@ -446,8 +495,8 @@
           <w:szCs w:val="24"/>
         </w:rPr>
       </w:pPr>
-      <w:bookmarkStart w:colFirst="0" w:colLast="0" w:name="_vmh97pbe81om" w:id="5"/>
-      <w:bookmarkEnd w:id="5"/>
+      <w:bookmarkStart w:colFirst="0" w:colLast="0" w:name="_vmh97pbe81om" w:id="7"/>
+      <w:bookmarkEnd w:id="7"/>
       <w:r>
         <w:rPr>
           <w:b w:val="1"/>
@@ -494,8 +543,8 @@
           <w:szCs w:val="24"/>
         </w:rPr>
       </w:pPr>
-      <w:bookmarkStart w:colFirst="0" w:colLast="0" w:name="_t2v5ukl5i531" w:id="6"/>
-      <w:bookmarkEnd w:id="6"/>
+      <w:bookmarkStart w:colFirst="0" w:colLast="0" w:name="_t2v5ukl5i531" w:id="8"/>
+      <w:bookmarkEnd w:id="8"/>
       <w:r>
         <w:rPr>
           <w:b w:val="1"/>
@@ -556,8 +605,8 @@
           <w:szCs w:val="24"/>
         </w:rPr>
       </w:pPr>
-      <w:bookmarkStart w:colFirst="0" w:colLast="0" w:name="_sy9umj6q3ee9" w:id="7"/>
-      <w:bookmarkEnd w:id="7"/>
+      <w:bookmarkStart w:colFirst="0" w:colLast="0" w:name="_sy9umj6q3ee9" w:id="9"/>
+      <w:bookmarkEnd w:id="9"/>
       <w:r>
         <w:rPr>
           <w:b w:val="1"/>
@@ -614,8 +663,8 @@
           <w:szCs w:val="24"/>
         </w:rPr>
       </w:pPr>
-      <w:bookmarkStart w:colFirst="0" w:colLast="0" w:name="_tgrdzwc27y9k" w:id="8"/>
-      <w:bookmarkEnd w:id="8"/>
+      <w:bookmarkStart w:colFirst="0" w:colLast="0" w:name="_tgrdzwc27y9k" w:id="10"/>
+      <w:bookmarkEnd w:id="10"/>
       <w:r>
         <w:rPr>
           <w:b w:val="1"/>
@@ -861,8 +910,8 @@
           <w:szCs w:val="24"/>
         </w:rPr>
       </w:pPr>
-      <w:bookmarkStart w:colFirst="0" w:colLast="0" w:name="_mn38ft51gf2s" w:id="9"/>
-      <w:bookmarkEnd w:id="9"/>
+      <w:bookmarkStart w:colFirst="0" w:colLast="0" w:name="_mn38ft51gf2s" w:id="11"/>
+      <w:bookmarkEnd w:id="11"/>
       <w:r>
         <w:rPr>
           <w:rtl w:val="0"/>
@@ -883,8 +932,8 @@
           <w:szCs w:val="24"/>
         </w:rPr>
       </w:pPr>
-      <w:bookmarkStart w:colFirst="0" w:colLast="0" w:name="_pbpfzlsrh135" w:id="10"/>
-      <w:bookmarkEnd w:id="10"/>
+      <w:bookmarkStart w:colFirst="0" w:colLast="0" w:name="_pbpfzlsrh135" w:id="12"/>
+      <w:bookmarkEnd w:id="12"/>
       <w:r>
         <w:rPr>
           <w:b w:val="1"/>
@@ -1158,8 +1207,8 @@
           <w:szCs w:val="24"/>
         </w:rPr>
       </w:pPr>
-      <w:bookmarkStart w:colFirst="0" w:colLast="0" w:name="_qfzf778iwwov" w:id="11"/>
-      <w:bookmarkEnd w:id="11"/>
+      <w:bookmarkStart w:colFirst="0" w:colLast="0" w:name="_qfzf778iwwov" w:id="13"/>
+      <w:bookmarkEnd w:id="13"/>
       <w:r>
         <w:rPr>
           <w:b w:val="1"/>
@@ -1723,8 +1772,8 @@
           <w:szCs w:val="24"/>
         </w:rPr>
       </w:pPr>
-      <w:bookmarkStart w:colFirst="0" w:colLast="0" w:name="_xdq98he53dar" w:id="12"/>
-      <w:bookmarkEnd w:id="12"/>
+      <w:bookmarkStart w:colFirst="0" w:colLast="0" w:name="_xdq98he53dar" w:id="14"/>
+      <w:bookmarkEnd w:id="14"/>
       <w:r>
         <w:rPr>
           <w:b w:val="1"/>
@@ -1765,8 +1814,8 @@
           <w:u w:val="none"/>
         </w:rPr>
       </w:pPr>
-      <w:bookmarkStart w:colFirst="0" w:colLast="0" w:name="_p3fot95zlxf8" w:id="13"/>
-      <w:bookmarkEnd w:id="13"/>
+      <w:bookmarkStart w:colFirst="0" w:colLast="0" w:name="_p3fot95zlxf8" w:id="15"/>
+      <w:bookmarkEnd w:id="15"/>
       <w:r>
         <w:rPr>
           <w:b w:val="1"/>
@@ -2060,8 +2109,8 @@
           <w:szCs w:val="24"/>
         </w:rPr>
       </w:pPr>
-      <w:bookmarkStart w:colFirst="0" w:colLast="0" w:name="_i0kvhdxbpddr" w:id="14"/>
-      <w:bookmarkEnd w:id="14"/>
+      <w:bookmarkStart w:colFirst="0" w:colLast="0" w:name="_i0kvhdxbpddr" w:id="16"/>
+      <w:bookmarkEnd w:id="16"/>
       <w:r>
         <w:rPr>
           <w:b w:val="1"/>
@@ -2344,8 +2393,8 @@
           <w:szCs w:val="24"/>
         </w:rPr>
       </w:pPr>
-      <w:bookmarkStart w:colFirst="0" w:colLast="0" w:name="_7tgn86ctqkb4" w:id="15"/>
-      <w:bookmarkEnd w:id="15"/>
+      <w:bookmarkStart w:colFirst="0" w:colLast="0" w:name="_7tgn86ctqkb4" w:id="17"/>
+      <w:bookmarkEnd w:id="17"/>
       <w:r>
         <w:rPr>
           <w:b w:val="1"/>
@@ -2640,8 +2689,8 @@
           <w:szCs w:val="24"/>
         </w:rPr>
       </w:pPr>
-      <w:bookmarkStart w:colFirst="0" w:colLast="0" w:name="_wdnkqknbsd1" w:id="16"/>
-      <w:bookmarkEnd w:id="16"/>
+      <w:bookmarkStart w:colFirst="0" w:colLast="0" w:name="_wdnkqknbsd1" w:id="18"/>
+      <w:bookmarkEnd w:id="18"/>
       <w:r>
         <w:rPr>
           <w:b w:val="1"/>
@@ -2940,8 +2989,8 @@
           <w:szCs w:val="24"/>
         </w:rPr>
       </w:pPr>
-      <w:bookmarkStart w:colFirst="0" w:colLast="0" w:name="_ciq1ebnybpgg" w:id="17"/>
-      <w:bookmarkEnd w:id="17"/>
+      <w:bookmarkStart w:colFirst="0" w:colLast="0" w:name="_ciq1ebnybpgg" w:id="19"/>
+      <w:bookmarkEnd w:id="19"/>
       <w:r>
         <w:rPr>
           <w:b w:val="1"/>
@@ -3189,8 +3238,8 @@
           <w:szCs w:val="24"/>
         </w:rPr>
       </w:pPr>
-      <w:bookmarkStart w:colFirst="0" w:colLast="0" w:name="_zd3zc2wxdns5" w:id="18"/>
-      <w:bookmarkEnd w:id="18"/>
+      <w:bookmarkStart w:colFirst="0" w:colLast="0" w:name="_zd3zc2wxdns5" w:id="20"/>
+      <w:bookmarkEnd w:id="20"/>
       <w:r>
         <w:rPr>
           <w:b w:val="1"/>
@@ -9223,7 +9272,7 @@
                 <w:szCs w:val="24"/>
                 <w:rtl w:val="0"/>
               </w:rPr>
-              <w:t xml:space="preserve">CASO DE USO EXPANDIDO - 001</w:t>
+              <w:t xml:space="preserve">CASO DE USO EXPANDIDO - 002</w:t>
             </w:r>
           </w:p>
         </w:tc>
@@ -10386,6 +10435,1256 @@
           <w:rtl w:val="0"/>
         </w:rPr>
         <w:t xml:space="preserve">                     </w:t>
+      </w:r>
+    </w:p>
+    <w:p>
+      <w:pPr>
+        <w:spacing w:line="360" w:lineRule="auto"/>
+        <w:jc w:val="both"/>
+        <w:rPr/>
+      </w:pPr>
+      <w:r>
+        <w:rPr>
+          <w:rtl w:val="0"/>
+        </w:rPr>
+      </w:r>
+    </w:p>
+    <w:p>
+      <w:pPr>
+        <w:spacing w:line="360" w:lineRule="auto"/>
+        <w:jc w:val="both"/>
+        <w:rPr/>
+      </w:pPr>
+      <w:r>
+        <w:rPr>
+          <w:rtl w:val="0"/>
+        </w:rPr>
+        <w:t xml:space="preserve">Rykelme</w:t>
+      </w:r>
+    </w:p>
+    <w:p>
+      <w:pPr>
+        <w:spacing w:line="360" w:lineRule="auto"/>
+        <w:jc w:val="both"/>
+        <w:rPr>
+          <w:sz w:val="24"/>
+          <w:szCs w:val="24"/>
+        </w:rPr>
+      </w:pPr>
+      <w:r>
+        <w:rPr>
+          <w:rtl w:val="0"/>
+        </w:rPr>
+      </w:r>
+    </w:p>
+    <w:tbl>
+      <w:tblPr>
+        <w:tblStyle w:val="Table8"/>
+        <w:tblW w:w="14010.0" w:type="dxa"/>
+        <w:jc w:val="left"/>
+        <w:tblBorders>
+          <w:top w:color="000000" w:space="0" w:sz="8" w:val="single"/>
+          <w:left w:color="000000" w:space="0" w:sz="8" w:val="single"/>
+          <w:bottom w:color="000000" w:space="0" w:sz="8" w:val="single"/>
+          <w:right w:color="000000" w:space="0" w:sz="8" w:val="single"/>
+          <w:insideH w:color="000000" w:space="0" w:sz="8" w:val="single"/>
+          <w:insideV w:color="000000" w:space="0" w:sz="8" w:val="single"/>
+        </w:tblBorders>
+        <w:tblLayout w:type="fixed"/>
+        <w:tblLook w:val="0600"/>
+      </w:tblPr>
+      <w:tblGrid>
+        <w:gridCol w:w="2535"/>
+        <w:gridCol w:w="11475"/>
+        <w:tblGridChange w:id="0">
+          <w:tblGrid>
+            <w:gridCol w:w="2535"/>
+            <w:gridCol w:w="11475"/>
+          </w:tblGrid>
+        </w:tblGridChange>
+      </w:tblGrid>
+      <w:tr>
+        <w:trPr>
+          <w:cantSplit w:val="0"/>
+          <w:tblHeader w:val="0"/>
+        </w:trPr>
+        <w:tc>
+          <w:tcPr>
+            <w:shd w:fill="999999" w:val="clear"/>
+            <w:tcMar>
+              <w:top w:w="100.0" w:type="dxa"/>
+              <w:left w:w="100.0" w:type="dxa"/>
+              <w:bottom w:w="100.0" w:type="dxa"/>
+              <w:right w:w="100.0" w:type="dxa"/>
+            </w:tcMar>
+            <w:vAlign w:val="top"/>
+          </w:tcPr>
+          <w:p>
+            <w:pPr>
+              <w:widowControl w:val="0"/>
+              <w:spacing w:line="240" w:lineRule="auto"/>
+              <w:rPr>
+                <w:b w:val="1"/>
+                <w:bCs w:val="1"/>
+                <w:sz w:val="24"/>
+                <w:szCs w:val="24"/>
+              </w:rPr>
+            </w:pPr>
+            <w:r>
+              <w:rPr>
+                <w:b w:val="1"/>
+                <w:bCs w:val="1"/>
+                <w:sz w:val="24"/>
+                <w:szCs w:val="24"/>
+                <w:rtl w:val="0"/>
+              </w:rPr>
+              <w:t xml:space="preserve">CASO DE USO EXPANDIDO - 003</w:t>
+            </w:r>
+          </w:p>
+        </w:tc>
+        <w:tc>
+          <w:tcPr>
+            <w:shd w:fill="999999" w:val="clear"/>
+            <w:tcMar>
+              <w:top w:w="100.0" w:type="dxa"/>
+              <w:left w:w="100.0" w:type="dxa"/>
+              <w:bottom w:w="100.0" w:type="dxa"/>
+              <w:right w:w="100.0" w:type="dxa"/>
+            </w:tcMar>
+            <w:vAlign w:val="top"/>
+          </w:tcPr>
+          <w:p>
+            <w:pPr>
+              <w:spacing w:line="360" w:lineRule="auto"/>
+              <w:jc w:val="both"/>
+              <w:rPr>
+                <w:b w:val="1"/>
+                <w:bCs w:val="1"/>
+                <w:sz w:val="24"/>
+                <w:szCs w:val="24"/>
+              </w:rPr>
+            </w:pPr>
+            <w:r>
+              <w:rPr>
+                <w:b w:val="1"/>
+                <w:bCs w:val="1"/>
+                <w:sz w:val="24"/>
+                <w:szCs w:val="24"/>
+                <w:rtl w:val="0"/>
+              </w:rPr>
+              <w:t xml:space="preserve">Nos convertidos para gerentes e administradores.</w:t>
+            </w:r>
+          </w:p>
+        </w:tc>
+      </w:tr>
+      <w:tr>
+        <w:trPr>
+          <w:cantSplit w:val="0"/>
+          <w:tblHeader w:val="0"/>
+        </w:trPr>
+        <w:tc>
+          <w:tcPr>
+            <w:shd w:fill="999999" w:val="clear"/>
+            <w:tcMar>
+              <w:top w:w="100.0" w:type="dxa"/>
+              <w:left w:w="100.0" w:type="dxa"/>
+              <w:bottom w:w="100.0" w:type="dxa"/>
+              <w:right w:w="100.0" w:type="dxa"/>
+            </w:tcMar>
+            <w:vAlign w:val="top"/>
+          </w:tcPr>
+          <w:p>
+            <w:pPr>
+              <w:widowControl w:val="0"/>
+              <w:spacing w:line="240" w:lineRule="auto"/>
+              <w:rPr>
+                <w:b w:val="1"/>
+                <w:bCs w:val="1"/>
+                <w:sz w:val="24"/>
+                <w:szCs w:val="24"/>
+              </w:rPr>
+            </w:pPr>
+            <w:r>
+              <w:rPr>
+                <w:b w:val="1"/>
+                <w:bCs w:val="1"/>
+                <w:sz w:val="24"/>
+                <w:szCs w:val="24"/>
+                <w:rtl w:val="0"/>
+              </w:rPr>
+              <w:t xml:space="preserve">Ator Principal: </w:t>
+            </w:r>
+          </w:p>
+        </w:tc>
+        <w:tc>
+          <w:tcPr>
+            <w:shd w:fill="auto" w:val="clear"/>
+            <w:tcMar>
+              <w:top w:w="100.0" w:type="dxa"/>
+              <w:left w:w="100.0" w:type="dxa"/>
+              <w:bottom w:w="100.0" w:type="dxa"/>
+              <w:right w:w="100.0" w:type="dxa"/>
+            </w:tcMar>
+            <w:vAlign w:val="top"/>
+          </w:tcPr>
+          <w:p>
+            <w:pPr>
+              <w:widowControl w:val="0"/>
+              <w:spacing w:line="240" w:lineRule="auto"/>
+              <w:rPr>
+                <w:sz w:val="24"/>
+                <w:szCs w:val="24"/>
+              </w:rPr>
+            </w:pPr>
+            <w:r>
+              <w:rPr>
+                <w:sz w:val="24"/>
+                <w:szCs w:val="24"/>
+                <w:rtl w:val="0"/>
+              </w:rPr>
+              <w:t xml:space="preserve">Administrador/Gerente</w:t>
+            </w:r>
+          </w:p>
+        </w:tc>
+      </w:tr>
+      <w:tr>
+        <w:trPr>
+          <w:cantSplit w:val="0"/>
+          <w:tblHeader w:val="0"/>
+        </w:trPr>
+        <w:tc>
+          <w:tcPr>
+            <w:shd w:fill="999999" w:val="clear"/>
+            <w:tcMar>
+              <w:top w:w="100.0" w:type="dxa"/>
+              <w:left w:w="100.0" w:type="dxa"/>
+              <w:bottom w:w="100.0" w:type="dxa"/>
+              <w:right w:w="100.0" w:type="dxa"/>
+            </w:tcMar>
+            <w:vAlign w:val="top"/>
+          </w:tcPr>
+          <w:p>
+            <w:pPr>
+              <w:widowControl w:val="0"/>
+              <w:spacing w:line="240" w:lineRule="auto"/>
+              <w:rPr>
+                <w:b w:val="1"/>
+                <w:bCs w:val="1"/>
+                <w:sz w:val="24"/>
+                <w:szCs w:val="24"/>
+              </w:rPr>
+            </w:pPr>
+            <w:r>
+              <w:rPr>
+                <w:b w:val="1"/>
+                <w:bCs w:val="1"/>
+                <w:sz w:val="24"/>
+                <w:szCs w:val="24"/>
+                <w:rtl w:val="0"/>
+              </w:rPr>
+              <w:t xml:space="preserve">Resumo: </w:t>
+            </w:r>
+          </w:p>
+        </w:tc>
+        <w:tc>
+          <w:tcPr>
+            <w:shd w:fill="auto" w:val="clear"/>
+            <w:tcMar>
+              <w:top w:w="100.0" w:type="dxa"/>
+              <w:left w:w="100.0" w:type="dxa"/>
+              <w:bottom w:w="100.0" w:type="dxa"/>
+              <w:right w:w="100.0" w:type="dxa"/>
+            </w:tcMar>
+            <w:vAlign w:val="top"/>
+          </w:tcPr>
+          <w:p>
+            <w:pPr>
+              <w:widowControl w:val="0"/>
+              <w:spacing w:line="240" w:lineRule="auto"/>
+              <w:jc w:val="both"/>
+              <w:rPr>
+                <w:sz w:val="24"/>
+                <w:szCs w:val="24"/>
+              </w:rPr>
+            </w:pPr>
+            <w:r>
+              <w:rPr>
+                <w:b w:val="1"/>
+                <w:bCs w:val="1"/>
+                <w:sz w:val="24"/>
+                <w:szCs w:val="24"/>
+                <w:rtl w:val="0"/>
+              </w:rPr>
+              <w:t xml:space="preserve"> </w:t>
+            </w:r>
+            <w:r>
+              <w:rPr>
+                <w:sz w:val="24"/>
+                <w:szCs w:val="24"/>
+                <w:rtl w:val="0"/>
+              </w:rPr>
+              <w:t xml:space="preserve">O sistema deve monitorar e permitir a suspensão temporária de anúncios/anunciantes ou o banimento definitivo de anunciantes flagrados comercializando produtos falsificados.</w:t>
+            </w:r>
+          </w:p>
+        </w:tc>
+      </w:tr>
+      <w:tr>
+        <w:trPr>
+          <w:cantSplit w:val="0"/>
+          <w:tblHeader w:val="0"/>
+        </w:trPr>
+        <w:tc>
+          <w:tcPr>
+            <w:shd w:fill="999999" w:val="clear"/>
+            <w:tcMar>
+              <w:top w:w="100.0" w:type="dxa"/>
+              <w:left w:w="100.0" w:type="dxa"/>
+              <w:bottom w:w="100.0" w:type="dxa"/>
+              <w:right w:w="100.0" w:type="dxa"/>
+            </w:tcMar>
+            <w:vAlign w:val="top"/>
+          </w:tcPr>
+          <w:p>
+            <w:pPr>
+              <w:widowControl w:val="0"/>
+              <w:spacing w:line="240" w:lineRule="auto"/>
+              <w:rPr>
+                <w:b w:val="1"/>
+                <w:bCs w:val="1"/>
+                <w:sz w:val="24"/>
+                <w:szCs w:val="24"/>
+              </w:rPr>
+            </w:pPr>
+            <w:r>
+              <w:rPr>
+                <w:b w:val="1"/>
+                <w:bCs w:val="1"/>
+                <w:sz w:val="24"/>
+                <w:szCs w:val="24"/>
+                <w:rtl w:val="0"/>
+              </w:rPr>
+              <w:t xml:space="preserve">Pré-condições: </w:t>
+            </w:r>
+          </w:p>
+        </w:tc>
+        <w:tc>
+          <w:tcPr>
+            <w:shd w:fill="auto" w:val="clear"/>
+            <w:tcMar>
+              <w:top w:w="100.0" w:type="dxa"/>
+              <w:left w:w="100.0" w:type="dxa"/>
+              <w:bottom w:w="100.0" w:type="dxa"/>
+              <w:right w:w="100.0" w:type="dxa"/>
+            </w:tcMar>
+            <w:vAlign w:val="top"/>
+          </w:tcPr>
+          <w:p>
+            <w:pPr>
+              <w:widowControl w:val="0"/>
+              <w:spacing w:line="240" w:lineRule="auto"/>
+              <w:rPr>
+                <w:sz w:val="24"/>
+                <w:szCs w:val="24"/>
+              </w:rPr>
+            </w:pPr>
+            <w:r>
+              <w:rPr>
+                <w:sz w:val="24"/>
+                <w:szCs w:val="24"/>
+                <w:rtl w:val="0"/>
+              </w:rPr>
+              <w:t xml:space="preserve">O Administrador pode banir o usuário que está vendendo vestimentas falsificadas.</w:t>
+            </w:r>
+          </w:p>
+        </w:tc>
+      </w:tr>
+      <w:tr>
+        <w:trPr>
+          <w:cantSplit w:val="0"/>
+          <w:tblHeader w:val="0"/>
+        </w:trPr>
+        <w:tc>
+          <w:tcPr>
+            <w:shd w:fill="999999" w:val="clear"/>
+            <w:tcMar>
+              <w:top w:w="100.0" w:type="dxa"/>
+              <w:left w:w="100.0" w:type="dxa"/>
+              <w:bottom w:w="100.0" w:type="dxa"/>
+              <w:right w:w="100.0" w:type="dxa"/>
+            </w:tcMar>
+            <w:vAlign w:val="top"/>
+          </w:tcPr>
+          <w:p>
+            <w:pPr>
+              <w:widowControl w:val="0"/>
+              <w:spacing w:line="240" w:lineRule="auto"/>
+              <w:rPr>
+                <w:b w:val="1"/>
+                <w:bCs w:val="1"/>
+                <w:sz w:val="24"/>
+                <w:szCs w:val="24"/>
+              </w:rPr>
+            </w:pPr>
+            <w:r>
+              <w:rPr>
+                <w:b w:val="1"/>
+                <w:bCs w:val="1"/>
+                <w:sz w:val="24"/>
+                <w:szCs w:val="24"/>
+                <w:rtl w:val="0"/>
+              </w:rPr>
+              <w:t xml:space="preserve">Pós-condições: </w:t>
+            </w:r>
+          </w:p>
+        </w:tc>
+        <w:tc>
+          <w:tcPr>
+            <w:shd w:fill="auto" w:val="clear"/>
+            <w:tcMar>
+              <w:top w:w="100.0" w:type="dxa"/>
+              <w:left w:w="100.0" w:type="dxa"/>
+              <w:bottom w:w="100.0" w:type="dxa"/>
+              <w:right w:w="100.0" w:type="dxa"/>
+            </w:tcMar>
+            <w:vAlign w:val="top"/>
+          </w:tcPr>
+          <w:p>
+            <w:pPr>
+              <w:widowControl w:val="0"/>
+              <w:spacing w:line="240" w:lineRule="auto"/>
+              <w:rPr>
+                <w:sz w:val="24"/>
+                <w:szCs w:val="24"/>
+              </w:rPr>
+            </w:pPr>
+            <w:r>
+              <w:rPr>
+                <w:sz w:val="24"/>
+                <w:szCs w:val="24"/>
+                <w:rtl w:val="0"/>
+              </w:rPr>
+              <w:t xml:space="preserve">O Gerente precisará autorizar o banimento do usuário, caso o usuário estiver vendendo legalmente, não poderá bani-lo. </w:t>
+            </w:r>
+          </w:p>
+        </w:tc>
+      </w:tr>
+      <w:tr>
+        <w:trPr>
+          <w:cantSplit w:val="0"/>
+          <w:tblHeader w:val="0"/>
+        </w:trPr>
+        <w:tc>
+          <w:tcPr>
+            <w:shd w:fill="999999" w:val="clear"/>
+            <w:tcMar>
+              <w:top w:w="100.0" w:type="dxa"/>
+              <w:left w:w="100.0" w:type="dxa"/>
+              <w:bottom w:w="100.0" w:type="dxa"/>
+              <w:right w:w="100.0" w:type="dxa"/>
+            </w:tcMar>
+            <w:vAlign w:val="top"/>
+          </w:tcPr>
+          <w:p>
+            <w:pPr>
+              <w:widowControl w:val="0"/>
+              <w:spacing w:line="240" w:lineRule="auto"/>
+              <w:rPr>
+                <w:b w:val="1"/>
+                <w:bCs w:val="1"/>
+                <w:sz w:val="24"/>
+                <w:szCs w:val="24"/>
+              </w:rPr>
+            </w:pPr>
+            <w:r>
+              <w:rPr>
+                <w:b w:val="1"/>
+                <w:bCs w:val="1"/>
+                <w:sz w:val="24"/>
+                <w:szCs w:val="24"/>
+                <w:rtl w:val="0"/>
+              </w:rPr>
+              <w:t xml:space="preserve">Fluxo Principal: </w:t>
+            </w:r>
+          </w:p>
+        </w:tc>
+        <w:tc>
+          <w:tcPr>
+            <w:shd w:fill="auto" w:val="clear"/>
+            <w:tcMar>
+              <w:top w:w="100.0" w:type="dxa"/>
+              <w:left w:w="100.0" w:type="dxa"/>
+              <w:bottom w:w="100.0" w:type="dxa"/>
+              <w:right w:w="100.0" w:type="dxa"/>
+            </w:tcMar>
+            <w:vAlign w:val="top"/>
+          </w:tcPr>
+          <w:p>
+            <w:pPr>
+              <w:widowControl w:val="0"/>
+              <w:spacing w:line="240" w:lineRule="auto"/>
+              <w:rPr>
+                <w:sz w:val="24"/>
+                <w:szCs w:val="24"/>
+              </w:rPr>
+            </w:pPr>
+            <w:r>
+              <w:rPr>
+                <w:sz w:val="24"/>
+                <w:szCs w:val="24"/>
+                <w:rtl w:val="0"/>
+              </w:rPr>
+              <w:t xml:space="preserve">1. O Administrador irá verificar o usuário que está vendendo ilegalmente e pedir a autorização para o Gerente.</w:t>
+            </w:r>
+          </w:p>
+          <w:p>
+            <w:pPr>
+              <w:widowControl w:val="0"/>
+              <w:spacing w:line="240" w:lineRule="auto"/>
+              <w:rPr>
+                <w:sz w:val="24"/>
+                <w:szCs w:val="24"/>
+              </w:rPr>
+            </w:pPr>
+            <w:r>
+              <w:rPr>
+                <w:rtl w:val="0"/>
+              </w:rPr>
+            </w:r>
+          </w:p>
+          <w:p>
+            <w:pPr>
+              <w:widowControl w:val="0"/>
+              <w:spacing w:line="240" w:lineRule="auto"/>
+              <w:rPr>
+                <w:sz w:val="24"/>
+                <w:szCs w:val="24"/>
+              </w:rPr>
+            </w:pPr>
+            <w:r>
+              <w:rPr>
+                <w:sz w:val="24"/>
+                <w:szCs w:val="24"/>
+                <w:rtl w:val="0"/>
+              </w:rPr>
+              <w:t xml:space="preserve">2.O Gerente consulta se o usuário está realmente vendendo produtos falsificados.</w:t>
+            </w:r>
+          </w:p>
+          <w:p>
+            <w:pPr>
+              <w:widowControl w:val="0"/>
+              <w:spacing w:line="240" w:lineRule="auto"/>
+              <w:rPr>
+                <w:sz w:val="24"/>
+                <w:szCs w:val="24"/>
+              </w:rPr>
+            </w:pPr>
+            <w:r>
+              <w:rPr>
+                <w:rtl w:val="0"/>
+              </w:rPr>
+            </w:r>
+          </w:p>
+          <w:p>
+            <w:pPr>
+              <w:widowControl w:val="0"/>
+              <w:spacing w:line="240" w:lineRule="auto"/>
+              <w:rPr>
+                <w:sz w:val="24"/>
+                <w:szCs w:val="24"/>
+              </w:rPr>
+            </w:pPr>
+            <w:r>
+              <w:rPr>
+                <w:sz w:val="24"/>
+                <w:szCs w:val="24"/>
+                <w:rtl w:val="0"/>
+              </w:rPr>
+              <w:t xml:space="preserve">3.Após a permissão do Gerente para banir o usuário, o Administrador irá determinar o tempo de banimento.</w:t>
+            </w:r>
+          </w:p>
+          <w:p>
+            <w:pPr>
+              <w:widowControl w:val="0"/>
+              <w:spacing w:line="240" w:lineRule="auto"/>
+              <w:rPr>
+                <w:sz w:val="24"/>
+                <w:szCs w:val="24"/>
+              </w:rPr>
+            </w:pPr>
+            <w:r>
+              <w:rPr>
+                <w:rtl w:val="0"/>
+              </w:rPr>
+            </w:r>
+          </w:p>
+        </w:tc>
+      </w:tr>
+      <w:tr>
+        <w:trPr>
+          <w:cantSplit w:val="0"/>
+          <w:tblHeader w:val="0"/>
+        </w:trPr>
+        <w:tc>
+          <w:tcPr>
+            <w:shd w:fill="999999" w:val="clear"/>
+            <w:tcMar>
+              <w:top w:w="100.0" w:type="dxa"/>
+              <w:left w:w="100.0" w:type="dxa"/>
+              <w:bottom w:w="100.0" w:type="dxa"/>
+              <w:right w:w="100.0" w:type="dxa"/>
+            </w:tcMar>
+            <w:vAlign w:val="top"/>
+          </w:tcPr>
+          <w:p>
+            <w:pPr>
+              <w:widowControl w:val="0"/>
+              <w:spacing w:line="240" w:lineRule="auto"/>
+              <w:rPr>
+                <w:b w:val="1"/>
+                <w:bCs w:val="1"/>
+                <w:sz w:val="24"/>
+                <w:szCs w:val="24"/>
+              </w:rPr>
+            </w:pPr>
+            <w:r>
+              <w:rPr>
+                <w:b w:val="1"/>
+                <w:bCs w:val="1"/>
+                <w:sz w:val="24"/>
+                <w:szCs w:val="24"/>
+                <w:rtl w:val="0"/>
+              </w:rPr>
+              <w:t xml:space="preserve">Fluxos Alternativos: </w:t>
+            </w:r>
+          </w:p>
+        </w:tc>
+        <w:tc>
+          <w:tcPr>
+            <w:shd w:fill="auto" w:val="clear"/>
+            <w:tcMar>
+              <w:top w:w="100.0" w:type="dxa"/>
+              <w:left w:w="100.0" w:type="dxa"/>
+              <w:bottom w:w="100.0" w:type="dxa"/>
+              <w:right w:w="100.0" w:type="dxa"/>
+            </w:tcMar>
+            <w:vAlign w:val="top"/>
+          </w:tcPr>
+          <w:p>
+            <w:pPr>
+              <w:widowControl w:val="0"/>
+              <w:spacing w:line="240" w:lineRule="auto"/>
+              <w:rPr>
+                <w:b w:val="1"/>
+                <w:bCs w:val="1"/>
+                <w:sz w:val="24"/>
+                <w:szCs w:val="24"/>
+              </w:rPr>
+            </w:pPr>
+            <w:r>
+              <w:rPr>
+                <w:b w:val="1"/>
+                <w:bCs w:val="1"/>
+                <w:sz w:val="24"/>
+                <w:szCs w:val="24"/>
+                <w:rtl w:val="0"/>
+              </w:rPr>
+              <w:t xml:space="preserve">FA01 - Mensagem de Banimento:</w:t>
+            </w:r>
+          </w:p>
+          <w:p>
+            <w:pPr>
+              <w:widowControl w:val="0"/>
+              <w:spacing w:line="240" w:lineRule="auto"/>
+              <w:rPr>
+                <w:sz w:val="24"/>
+                <w:szCs w:val="24"/>
+              </w:rPr>
+            </w:pPr>
+            <w:r>
+              <w:rPr>
+                <w:rtl w:val="0"/>
+              </w:rPr>
+            </w:r>
+          </w:p>
+          <w:p>
+            <w:pPr>
+              <w:widowControl w:val="0"/>
+              <w:numPr>
+                <w:ilvl w:val="0"/>
+                <w:numId w:val="10"/>
+              </w:numPr>
+              <w:spacing w:line="240" w:lineRule="auto"/>
+              <w:ind w:left="720" w:hanging="360"/>
+              <w:rPr>
+                <w:sz w:val="24"/>
+                <w:szCs w:val="24"/>
+              </w:rPr>
+            </w:pPr>
+            <w:r>
+              <w:rPr>
+                <w:b w:val="1"/>
+                <w:bCs w:val="1"/>
+                <w:sz w:val="24"/>
+                <w:szCs w:val="24"/>
+                <w:rtl w:val="0"/>
+              </w:rPr>
+              <w:t xml:space="preserve">3a.</w:t>
+            </w:r>
+            <w:r>
+              <w:rPr>
+                <w:sz w:val="24"/>
+                <w:szCs w:val="24"/>
+                <w:rtl w:val="0"/>
+              </w:rPr>
+              <w:t xml:space="preserve"> O usuário/cliente será notificado com a mensagem de banimento.</w:t>
+            </w:r>
+          </w:p>
+          <w:p>
+            <w:pPr>
+              <w:widowControl w:val="0"/>
+              <w:spacing w:line="240" w:lineRule="auto"/>
+              <w:ind w:left="720" w:firstLine="0"/>
+              <w:rPr>
+                <w:sz w:val="24"/>
+                <w:szCs w:val="24"/>
+              </w:rPr>
+            </w:pPr>
+            <w:r>
+              <w:rPr>
+                <w:rtl w:val="0"/>
+              </w:rPr>
+            </w:r>
+          </w:p>
+          <w:p>
+            <w:pPr>
+              <w:widowControl w:val="0"/>
+              <w:numPr>
+                <w:ilvl w:val="0"/>
+                <w:numId w:val="10"/>
+              </w:numPr>
+              <w:spacing w:line="240" w:lineRule="auto"/>
+              <w:ind w:left="720" w:hanging="360"/>
+              <w:rPr>
+                <w:sz w:val="24"/>
+                <w:szCs w:val="24"/>
+              </w:rPr>
+            </w:pPr>
+            <w:r>
+              <w:rPr>
+                <w:b w:val="1"/>
+                <w:bCs w:val="1"/>
+                <w:sz w:val="24"/>
+                <w:szCs w:val="24"/>
+                <w:rtl w:val="0"/>
+              </w:rPr>
+              <w:t xml:space="preserve">3b.</w:t>
+            </w:r>
+            <w:r>
+              <w:rPr>
+                <w:sz w:val="24"/>
+                <w:szCs w:val="24"/>
+                <w:rtl w:val="0"/>
+              </w:rPr>
+              <w:t xml:space="preserve"> O usuário/cliente poderá recorrer a sua conta de novo. </w:t>
+            </w:r>
+          </w:p>
+          <w:p>
+            <w:pPr>
+              <w:widowControl w:val="0"/>
+              <w:spacing w:line="240" w:lineRule="auto"/>
+              <w:rPr>
+                <w:sz w:val="24"/>
+                <w:szCs w:val="24"/>
+              </w:rPr>
+            </w:pPr>
+            <w:r>
+              <w:rPr>
+                <w:rtl w:val="0"/>
+              </w:rPr>
+            </w:r>
+          </w:p>
+        </w:tc>
+      </w:tr>
+      <w:tr>
+        <w:trPr>
+          <w:cantSplit w:val="0"/>
+          <w:trHeight w:val="2060.859375" w:hRule="atLeast"/>
+          <w:tblHeader w:val="0"/>
+        </w:trPr>
+        <w:tc>
+          <w:tcPr>
+            <w:shd w:fill="999999" w:val="clear"/>
+            <w:tcMar>
+              <w:top w:w="100.0" w:type="dxa"/>
+              <w:left w:w="100.0" w:type="dxa"/>
+              <w:bottom w:w="100.0" w:type="dxa"/>
+              <w:right w:w="100.0" w:type="dxa"/>
+            </w:tcMar>
+            <w:vAlign w:val="top"/>
+          </w:tcPr>
+          <w:p>
+            <w:pPr>
+              <w:widowControl w:val="0"/>
+              <w:spacing w:line="240" w:lineRule="auto"/>
+              <w:rPr>
+                <w:b w:val="1"/>
+                <w:bCs w:val="1"/>
+                <w:sz w:val="24"/>
+                <w:szCs w:val="24"/>
+              </w:rPr>
+            </w:pPr>
+            <w:r>
+              <w:rPr>
+                <w:b w:val="1"/>
+                <w:bCs w:val="1"/>
+                <w:sz w:val="24"/>
+                <w:szCs w:val="24"/>
+                <w:rtl w:val="0"/>
+              </w:rPr>
+              <w:t xml:space="preserve">Fluxos de Exceção: </w:t>
+            </w:r>
+          </w:p>
+        </w:tc>
+        <w:tc>
+          <w:tcPr>
+            <w:shd w:fill="auto" w:val="clear"/>
+            <w:tcMar>
+              <w:top w:w="100.0" w:type="dxa"/>
+              <w:left w:w="100.0" w:type="dxa"/>
+              <w:bottom w:w="100.0" w:type="dxa"/>
+              <w:right w:w="100.0" w:type="dxa"/>
+            </w:tcMar>
+            <w:vAlign w:val="top"/>
+          </w:tcPr>
+          <w:p>
+            <w:pPr>
+              <w:widowControl w:val="0"/>
+              <w:spacing w:line="240" w:lineRule="auto"/>
+              <w:rPr>
+                <w:b w:val="1"/>
+                <w:bCs w:val="1"/>
+                <w:sz w:val="24"/>
+                <w:szCs w:val="24"/>
+              </w:rPr>
+            </w:pPr>
+            <w:r>
+              <w:rPr>
+                <w:b w:val="1"/>
+                <w:bCs w:val="1"/>
+                <w:sz w:val="24"/>
+                <w:szCs w:val="24"/>
+                <w:rtl w:val="0"/>
+              </w:rPr>
+              <w:t xml:space="preserve">FE01 -Gestação de Banimento:</w:t>
+            </w:r>
+          </w:p>
+          <w:p>
+            <w:pPr>
+              <w:widowControl w:val="0"/>
+              <w:spacing w:line="240" w:lineRule="auto"/>
+              <w:rPr>
+                <w:sz w:val="24"/>
+                <w:szCs w:val="24"/>
+              </w:rPr>
+            </w:pPr>
+            <w:r>
+              <w:rPr>
+                <w:rtl w:val="0"/>
+              </w:rPr>
+            </w:r>
+          </w:p>
+          <w:p>
+            <w:pPr>
+              <w:widowControl w:val="0"/>
+              <w:numPr>
+                <w:ilvl w:val="0"/>
+                <w:numId w:val="9"/>
+              </w:numPr>
+              <w:spacing w:line="240" w:lineRule="auto"/>
+              <w:ind w:left="720" w:hanging="360"/>
+              <w:rPr>
+                <w:sz w:val="24"/>
+                <w:szCs w:val="24"/>
+              </w:rPr>
+            </w:pPr>
+            <w:r>
+              <w:rPr>
+                <w:b w:val="1"/>
+                <w:bCs w:val="1"/>
+                <w:sz w:val="24"/>
+                <w:szCs w:val="24"/>
+                <w:rtl w:val="0"/>
+              </w:rPr>
+              <w:t xml:space="preserve">2a.</w:t>
+            </w:r>
+            <w:r>
+              <w:rPr>
+                <w:sz w:val="24"/>
+                <w:szCs w:val="24"/>
+                <w:rtl w:val="0"/>
+              </w:rPr>
+              <w:t xml:space="preserve">O Gerente poderá banir o usuário que não está cumprindo as normas.</w:t>
+            </w:r>
+            <w:r>
+              <w:rPr>
+                <w:rtl w:val="0"/>
+              </w:rPr>
+            </w:r>
+          </w:p>
+          <w:p>
+            <w:pPr>
+              <w:widowControl w:val="0"/>
+              <w:spacing w:line="240" w:lineRule="auto"/>
+              <w:ind w:left="720" w:firstLine="0"/>
+              <w:rPr>
+                <w:sz w:val="24"/>
+                <w:szCs w:val="24"/>
+              </w:rPr>
+            </w:pPr>
+            <w:r>
+              <w:rPr>
+                <w:rtl w:val="0"/>
+              </w:rPr>
+            </w:r>
+          </w:p>
+          <w:p>
+            <w:pPr>
+              <w:widowControl w:val="0"/>
+              <w:numPr>
+                <w:ilvl w:val="0"/>
+                <w:numId w:val="9"/>
+              </w:numPr>
+              <w:spacing w:line="240" w:lineRule="auto"/>
+              <w:ind w:left="720" w:hanging="360"/>
+              <w:rPr>
+                <w:sz w:val="24"/>
+                <w:szCs w:val="24"/>
+              </w:rPr>
+            </w:pPr>
+            <w:r>
+              <w:rPr>
+                <w:b w:val="1"/>
+                <w:bCs w:val="1"/>
+                <w:sz w:val="24"/>
+                <w:szCs w:val="24"/>
+                <w:rtl w:val="0"/>
+              </w:rPr>
+              <w:t xml:space="preserve">2b.</w:t>
+            </w:r>
+            <w:r>
+              <w:rPr>
+                <w:sz w:val="24"/>
+                <w:szCs w:val="24"/>
+                <w:rtl w:val="0"/>
+              </w:rPr>
+              <w:t xml:space="preserve">O usuário/cliente será penalizado com banimento permanente ou terá uma data que irá voltar a conta</w:t>
+            </w:r>
+            <w:r>
+              <w:rPr>
+                <w:sz w:val="24"/>
+                <w:szCs w:val="24"/>
+                <w:rtl w:val="0"/>
+              </w:rPr>
+              <w:t xml:space="preserve">.</w:t>
+            </w:r>
+          </w:p>
+        </w:tc>
+      </w:tr>
+      <w:tr>
+        <w:trPr>
+          <w:cantSplit w:val="0"/>
+          <w:tblHeader w:val="0"/>
+        </w:trPr>
+        <w:tc>
+          <w:tcPr>
+            <w:shd w:fill="999999" w:val="clear"/>
+            <w:tcMar>
+              <w:top w:w="100.0" w:type="dxa"/>
+              <w:left w:w="100.0" w:type="dxa"/>
+              <w:bottom w:w="100.0" w:type="dxa"/>
+              <w:right w:w="100.0" w:type="dxa"/>
+            </w:tcMar>
+            <w:vAlign w:val="top"/>
+          </w:tcPr>
+          <w:p>
+            <w:pPr>
+              <w:widowControl w:val="0"/>
+              <w:spacing w:line="240" w:lineRule="auto"/>
+              <w:rPr>
+                <w:b w:val="1"/>
+                <w:bCs w:val="1"/>
+                <w:sz w:val="24"/>
+                <w:szCs w:val="24"/>
+              </w:rPr>
+            </w:pPr>
+            <w:r>
+              <w:rPr>
+                <w:b w:val="1"/>
+                <w:bCs w:val="1"/>
+                <w:sz w:val="24"/>
+                <w:szCs w:val="24"/>
+                <w:rtl w:val="0"/>
+              </w:rPr>
+              <w:t xml:space="preserve">Relações de Regras de Negócio: </w:t>
+            </w:r>
+          </w:p>
+        </w:tc>
+        <w:tc>
+          <w:tcPr>
+            <w:shd w:fill="auto" w:val="clear"/>
+            <w:tcMar>
+              <w:top w:w="100.0" w:type="dxa"/>
+              <w:left w:w="100.0" w:type="dxa"/>
+              <w:bottom w:w="100.0" w:type="dxa"/>
+              <w:right w:w="100.0" w:type="dxa"/>
+            </w:tcMar>
+            <w:vAlign w:val="top"/>
+          </w:tcPr>
+          <w:p>
+            <w:pPr>
+              <w:widowControl w:val="0"/>
+              <w:numPr>
+                <w:ilvl w:val="0"/>
+                <w:numId w:val="4"/>
+              </w:numPr>
+              <w:spacing w:line="240" w:lineRule="auto"/>
+              <w:ind w:left="720" w:hanging="360"/>
+              <w:rPr>
+                <w:sz w:val="24"/>
+                <w:szCs w:val="24"/>
+              </w:rPr>
+            </w:pPr>
+            <w:r>
+              <w:rPr>
+                <w:b w:val="1"/>
+                <w:bCs w:val="1"/>
+                <w:sz w:val="24"/>
+                <w:szCs w:val="24"/>
+                <w:rtl w:val="0"/>
+              </w:rPr>
+              <w:t xml:space="preserve">RN02</w:t>
+            </w:r>
+            <w:r>
+              <w:rPr>
+                <w:sz w:val="24"/>
+                <w:szCs w:val="24"/>
+                <w:rtl w:val="0"/>
+              </w:rPr>
+              <w:t xml:space="preserve"> </w:t>
+            </w:r>
+          </w:p>
+          <w:p>
+            <w:pPr>
+              <w:widowControl w:val="0"/>
+              <w:spacing w:line="240" w:lineRule="auto"/>
+              <w:ind w:left="720" w:firstLine="0"/>
+              <w:rPr>
+                <w:sz w:val="24"/>
+                <w:szCs w:val="24"/>
+              </w:rPr>
+            </w:pPr>
+            <w:r>
+              <w:rPr>
+                <w:rtl w:val="0"/>
+              </w:rPr>
+            </w:r>
+          </w:p>
+          <w:p>
+            <w:pPr>
+              <w:widowControl w:val="0"/>
+              <w:numPr>
+                <w:ilvl w:val="0"/>
+                <w:numId w:val="4"/>
+              </w:numPr>
+              <w:spacing w:line="240" w:lineRule="auto"/>
+              <w:ind w:left="720" w:hanging="360"/>
+              <w:rPr>
+                <w:b w:val="1"/>
+                <w:bCs w:val="1"/>
+                <w:sz w:val="24"/>
+                <w:szCs w:val="24"/>
+              </w:rPr>
+            </w:pPr>
+            <w:r>
+              <w:rPr>
+                <w:b w:val="1"/>
+                <w:bCs w:val="1"/>
+                <w:sz w:val="24"/>
+                <w:szCs w:val="24"/>
+                <w:rtl w:val="0"/>
+              </w:rPr>
+              <w:t xml:space="preserve">RF03 </w:t>
+            </w:r>
+          </w:p>
+        </w:tc>
+      </w:tr>
+    </w:tbl>
+    <w:p>
+      <w:pPr>
+        <w:spacing w:line="360" w:lineRule="auto"/>
+        <w:jc w:val="both"/>
+        <w:rPr/>
+      </w:pPr>
+      <w:r>
+        <w:rPr>
+          <w:rtl w:val="0"/>
+        </w:rPr>
+      </w:r>
+    </w:p>
+    <w:p>
+      <w:pPr>
+        <w:spacing w:line="360" w:lineRule="auto"/>
+        <w:jc w:val="both"/>
+        <w:rPr/>
+      </w:pPr>
+      <w:r>
+        <w:rPr>
+          <w:rtl w:val="0"/>
+        </w:rPr>
+      </w:r>
+    </w:p>
+    <w:p>
+      <w:pPr>
+        <w:spacing w:line="360" w:lineRule="auto"/>
+        <w:jc w:val="both"/>
+        <w:rPr/>
+      </w:pPr>
+      <w:r>
+        <w:rPr>
+          <w:rtl w:val="0"/>
+        </w:rPr>
+      </w:r>
+    </w:p>
+    <w:p>
+      <w:pPr>
+        <w:spacing w:line="360" w:lineRule="auto"/>
+        <w:jc w:val="both"/>
+        <w:rPr/>
+      </w:pPr>
+      <w:r>
+        <w:rPr>
+          <w:rtl w:val="0"/>
+        </w:rPr>
+      </w:r>
+    </w:p>
+    <w:p>
+      <w:pPr>
+        <w:spacing w:line="360" w:lineRule="auto"/>
+        <w:jc w:val="both"/>
+        <w:rPr/>
+      </w:pPr>
+      <w:r>
+        <w:rPr>
+          <w:rtl w:val="0"/>
+        </w:rPr>
+      </w:r>
+    </w:p>
+    <w:p>
+      <w:pPr>
+        <w:spacing w:line="360" w:lineRule="auto"/>
+        <w:jc w:val="both"/>
+        <w:rPr/>
+      </w:pPr>
+      <w:r>
+        <w:rPr>
+          <w:rtl w:val="0"/>
+        </w:rPr>
+      </w:r>
+    </w:p>
+    <w:p>
+      <w:pPr>
+        <w:spacing w:line="360" w:lineRule="auto"/>
+        <w:jc w:val="both"/>
+        <w:rPr/>
+      </w:pPr>
+      <w:r>
+        <w:rPr>
+          <w:rtl w:val="0"/>
+        </w:rPr>
+      </w:r>
+    </w:p>
+    <w:p>
+      <w:pPr>
+        <w:spacing w:line="360" w:lineRule="auto"/>
+        <w:jc w:val="both"/>
+        <w:rPr/>
+      </w:pPr>
+      <w:r>
+        <w:rPr>
+          <w:rtl w:val="0"/>
+        </w:rPr>
+      </w:r>
+    </w:p>
+    <w:p>
+      <w:pPr>
+        <w:spacing w:line="360" w:lineRule="auto"/>
+        <w:jc w:val="both"/>
+        <w:rPr/>
+      </w:pPr>
+      <w:r>
+        <w:rPr>
+          <w:rtl w:val="0"/>
+        </w:rPr>
+      </w:r>
+    </w:p>
+    <w:p>
+      <w:pPr>
+        <w:spacing w:line="360" w:lineRule="auto"/>
+        <w:jc w:val="both"/>
+        <w:rPr/>
+      </w:pPr>
+      <w:r>
+        <w:rPr>
+          <w:rtl w:val="0"/>
+        </w:rPr>
+      </w:r>
+    </w:p>
+    <w:p>
+      <w:pPr>
+        <w:spacing w:line="360" w:lineRule="auto"/>
+        <w:jc w:val="both"/>
+        <w:rPr/>
+      </w:pPr>
+      <w:r>
+        <w:rPr>
+          <w:rtl w:val="0"/>
+        </w:rPr>
+      </w:r>
+    </w:p>
+    <w:p>
+      <w:pPr>
+        <w:spacing w:line="360" w:lineRule="auto"/>
+        <w:jc w:val="both"/>
+        <w:rPr/>
+      </w:pPr>
+      <w:r>
+        <w:rPr>
+          <w:rtl w:val="0"/>
+        </w:rPr>
+      </w:r>
+    </w:p>
+    <w:p>
+      <w:pPr>
+        <w:spacing w:line="360" w:lineRule="auto"/>
+        <w:jc w:val="both"/>
+        <w:rPr/>
+      </w:pPr>
+      <w:r>
+        <w:rPr>
+          <w:rtl w:val="0"/>
+        </w:rPr>
+      </w:r>
+    </w:p>
+    <w:p>
+      <w:pPr>
+        <w:spacing w:line="360" w:lineRule="auto"/>
+        <w:jc w:val="both"/>
+        <w:rPr/>
+      </w:pPr>
+      <w:r>
+        <w:rPr>
+          <w:rtl w:val="0"/>
+        </w:rPr>
       </w:r>
     </w:p>
     <w:p>
@@ -11764,6 +13063,13 @@
     </w:tblPr>
   </w:style>
   <w:style w:type="table" w:styleId="Table7">
+    <w:basedOn w:val="TableNormal"/>
+    <w:tblPr>
+      <w:tblStyleRowBandSize w:val="1"/>
+      <w:tblStyleColBandSize w:val="1"/>
+    </w:tblPr>
+  </w:style>
+  <w:style w:type="table" w:styleId="Table8">
     <w:basedOn w:val="TableNormal"/>
     <w:tblPr>
       <w:tblStyleRowBandSize w:val="1"/>

</xml_diff>